<commit_message>
nmv 27 09 2026
</commit_message>
<xml_diff>
--- a/TS-Kramam/TS-4.4/TS 4.4 Malayalam Krama Paatam Corrections.docx
+++ b/TS-Kramam/TS-4.4/TS 4.4 Malayalam Krama Paatam Corrections.docx
@@ -1,6 +1,6 @@
 
 <file path=word/document.xml><?xml version="1.0" encoding="utf-8"?>
-<w:document xmlns:wpc="http://schemas.microsoft.com/office/word/2010/wordprocessingCanvas" xmlns:cx="http://schemas.microsoft.com/office/drawing/2014/chartex" xmlns:cx1="http://schemas.microsoft.com/office/drawing/2015/9/8/chartex" xmlns:cx2="http://schemas.microsoft.com/office/drawing/2015/10/21/chartex" xmlns:cx3="http://schemas.microsoft.com/office/drawing/2016/5/9/chartex" xmlns:cx4="http://schemas.microsoft.com/office/drawing/2016/5/10/chartex" xmlns:cx5="http://schemas.microsoft.com/office/drawing/2016/5/11/chartex" xmlns:cx6="http://schemas.microsoft.com/office/drawing/2016/5/12/chartex" xmlns:cx7="http://schemas.microsoft.com/office/drawing/2016/5/13/chartex" xmlns:cx8="http://schemas.microsoft.com/office/drawing/2016/5/14/chartex" xmlns:mc="http://schemas.openxmlformats.org/markup-compatibility/2006" xmlns:aink="http://schemas.microsoft.com/office/drawing/2016/ink" xmlns:am3d="http://schemas.microsoft.com/office/drawing/2017/model3d" xmlns:o="urn:schemas-microsoft-com:office:office" xmlns:oel="http://schemas.microsoft.com/office/2019/extlst" xmlns:r="http://schemas.openxmlformats.org/officeDocument/2006/relationships" xmlns:m="http://schemas.openxmlformats.org/officeDocument/2006/math" xmlns:v="urn:schemas-microsoft-com:vml" xmlns:wp14="http://schemas.microsoft.com/office/word/2010/wordprocessingDrawing" xmlns:wp="http://schemas.openxmlformats.org/drawingml/2006/wordprocessingDrawing" xmlns:w10="urn:schemas-microsoft-com:office:word" xmlns:w="http://schemas.openxmlformats.org/wordprocessingml/2006/main" xmlns:w14="http://schemas.microsoft.com/office/word/2010/wordml" xmlns:w15="http://schemas.microsoft.com/office/word/2012/wordml" xmlns:w16cei="http://schemas.microsoft.com/office/word/2026/wordml/cei" xmlns:w16cex="http://schemas.microsoft.com/office/word/2018/wordml/cex" xmlns:w16cid="http://schemas.microsoft.com/office/word/2016/wordml/cid" xmlns:w16="http://schemas.microsoft.com/office/word/2018/wordml" xmlns:w16du="http://schemas.microsoft.com/office/word/2023/wordml/word16du" xmlns:w16sdtdh="http://schemas.microsoft.com/office/word/2020/wordml/sdtdatahash" xmlns:w16sdtfl="http://schemas.microsoft.com/office/word/2024/wordml/sdtformatlock" xmlns:w16se="http://schemas.microsoft.com/office/word/2015/wordml/symex" xmlns:wpg="http://schemas.microsoft.com/office/word/2010/wordprocessingGroup" xmlns:wpi="http://schemas.microsoft.com/office/word/2010/wordprocessingInk" xmlns:wne="http://schemas.microsoft.com/office/word/2006/wordml" xmlns:wps="http://schemas.microsoft.com/office/word/2010/wordprocessingShape" mc:Ignorable="w14 w15 w16se w16cid w16 w16cex w16sdtdh w16sdtfl w16du wp14">
+<w:document xmlns:wpc="http://schemas.microsoft.com/office/word/2010/wordprocessingCanvas" xmlns:cx="http://schemas.microsoft.com/office/drawing/2014/chartex" xmlns:cx1="http://schemas.microsoft.com/office/drawing/2015/9/8/chartex" xmlns:cx2="http://schemas.microsoft.com/office/drawing/2015/10/21/chartex" xmlns:cx3="http://schemas.microsoft.com/office/drawing/2016/5/9/chartex" xmlns:cx4="http://schemas.microsoft.com/office/drawing/2016/5/10/chartex" xmlns:cx5="http://schemas.microsoft.com/office/drawing/2016/5/11/chartex" xmlns:cx6="http://schemas.microsoft.com/office/drawing/2016/5/12/chartex" xmlns:cx7="http://schemas.microsoft.com/office/drawing/2016/5/13/chartex" xmlns:cx8="http://schemas.microsoft.com/office/drawing/2016/5/14/chartex" xmlns:mc="http://schemas.openxmlformats.org/markup-compatibility/2006" xmlns:aink="http://schemas.microsoft.com/office/drawing/2016/ink" xmlns:am3d="http://schemas.microsoft.com/office/drawing/2017/model3d" xmlns:o="urn:schemas-microsoft-com:office:office" xmlns:oel="http://schemas.microsoft.com/office/2019/extlst" xmlns:r="http://schemas.openxmlformats.org/officeDocument/2006/relationships" xmlns:m="http://schemas.openxmlformats.org/officeDocument/2006/math" xmlns:v="urn:schemas-microsoft-com:vml" xmlns:wp14="http://schemas.microsoft.com/office/word/2010/wordprocessingDrawing" xmlns:wp="http://schemas.openxmlformats.org/drawingml/2006/wordprocessingDrawing" xmlns:w10="urn:schemas-microsoft-com:office:word" xmlns:w="http://schemas.openxmlformats.org/wordprocessingml/2006/main" xmlns:w14="http://schemas.microsoft.com/office/word/2010/wordml" xmlns:w15="http://schemas.microsoft.com/office/word/2012/wordml" xmlns:w16cex="http://schemas.microsoft.com/office/word/2018/wordml/cex" xmlns:w16cid="http://schemas.microsoft.com/office/word/2016/wordml/cid" xmlns:w16="http://schemas.microsoft.com/office/word/2018/wordml" xmlns:w16du="http://schemas.microsoft.com/office/word/2023/wordml/word16du" xmlns:w16sdtdh="http://schemas.microsoft.com/office/word/2020/wordml/sdtdatahash" xmlns:w16sdtfl="http://schemas.microsoft.com/office/word/2024/wordml/sdtformatlock" xmlns:w16se="http://schemas.microsoft.com/office/word/2015/wordml/symex" xmlns:wpg="http://schemas.microsoft.com/office/word/2010/wordprocessingGroup" xmlns:wpi="http://schemas.microsoft.com/office/word/2010/wordprocessingInk" xmlns:wne="http://schemas.microsoft.com/office/word/2006/wordml" xmlns:wps="http://schemas.microsoft.com/office/word/2010/wordprocessingShape" mc:Ignorable="w14 w15 w16se w16cid w16 w16cex w16sdtdh w16sdtfl w16du wp14">
   <w:body>
     <w:p>
       <w:pPr>
@@ -268,6 +268,743 @@
                 <w:sz w:val="28"/>
                 <w:szCs w:val="32"/>
               </w:rPr>
+              <w:t>T.S.4.4.3.2</w:t>
+            </w:r>
+            <w:r>
+              <w:rPr>
+                <w:rFonts w:cs="Arial"/>
+                <w:b/>
+                <w:sz w:val="28"/>
+                <w:szCs w:val="32"/>
+              </w:rPr>
+              <w:t xml:space="preserve"> – Kramam</w:t>
+            </w:r>
+          </w:p>
+          <w:p>
+            <w:pPr>
+              <w:widowControl w:val="0"/>
+              <w:tabs>
+                <w:tab w:val="left" w:pos="993"/>
+              </w:tabs>
+              <w:autoSpaceDE w:val="0"/>
+              <w:autoSpaceDN w:val="0"/>
+              <w:adjustRightInd w:val="0"/>
+              <w:spacing w:before="0" w:line="240" w:lineRule="auto"/>
+              <w:ind w:right="297"/>
+              <w:rPr>
+                <w:rFonts w:cs="Arial"/>
+                <w:b/>
+                <w:sz w:val="28"/>
+                <w:szCs w:val="32"/>
+              </w:rPr>
+            </w:pPr>
+            <w:r>
+              <w:rPr>
+                <w:rFonts w:cs="Arial"/>
+                <w:b/>
+                <w:sz w:val="28"/>
+                <w:szCs w:val="32"/>
+              </w:rPr>
+              <w:t xml:space="preserve">Krama Vaakyam No.– </w:t>
+            </w:r>
+            <w:r>
+              <w:rPr>
+                <w:rFonts w:cs="Arial"/>
+                <w:b/>
+                <w:sz w:val="28"/>
+                <w:szCs w:val="32"/>
+              </w:rPr>
+              <w:t>22</w:t>
+            </w:r>
+          </w:p>
+          <w:p>
+            <w:pPr>
+              <w:widowControl w:val="0"/>
+              <w:tabs>
+                <w:tab w:val="left" w:pos="993"/>
+              </w:tabs>
+              <w:autoSpaceDE w:val="0"/>
+              <w:autoSpaceDN w:val="0"/>
+              <w:adjustRightInd w:val="0"/>
+              <w:spacing w:before="0" w:line="240" w:lineRule="auto"/>
+              <w:ind w:right="297"/>
+              <w:rPr>
+                <w:rFonts w:cs="Arial"/>
+                <w:b/>
+                <w:sz w:val="28"/>
+                <w:szCs w:val="32"/>
+              </w:rPr>
+            </w:pPr>
+            <w:r>
+              <w:rPr>
+                <w:rFonts w:cs="Arial"/>
+                <w:b/>
+                <w:sz w:val="28"/>
+                <w:szCs w:val="32"/>
+              </w:rPr>
+              <w:t>Panchaati No</w:t>
+            </w:r>
+            <w:r>
+              <w:rPr>
+                <w:rFonts w:cs="Arial"/>
+                <w:b/>
+                <w:szCs w:val="32"/>
+              </w:rPr>
+              <w:t xml:space="preserve">. - </w:t>
+            </w:r>
+            <w:r>
+              <w:rPr>
+                <w:rFonts w:cs="Arial"/>
+                <w:b/>
+                <w:sz w:val="28"/>
+                <w:szCs w:val="28"/>
+              </w:rPr>
+              <w:t>8</w:t>
+            </w:r>
+          </w:p>
+        </w:tc>
+        <w:tc>
+          <w:tcPr>
+            <w:tcW w:w="5103" w:type="dxa"/>
+          </w:tcPr>
+          <w:p>
+            <w:pPr>
+              <w:widowControl w:val="0"/>
+              <w:autoSpaceDE w:val="0"/>
+              <w:autoSpaceDN w:val="0"/>
+              <w:adjustRightInd w:val="0"/>
+              <w:spacing w:before="0" w:line="240" w:lineRule="auto"/>
+              <w:rPr>
+                <w:rFonts w:ascii="BRH Malayalam Extra" w:hAnsi="BRH Malayalam Extra" w:cs="BRH Malayalam Extra"/>
+                <w:color w:val="000000"/>
+                <w:sz w:val="40"/>
+                <w:szCs w:val="40"/>
+              </w:rPr>
+            </w:pPr>
+            <w:r>
+              <w:rPr>
+                <w:rFonts w:ascii="BRH Malayalam Extra" w:hAnsi="BRH Malayalam Extra" w:cs="BRH Malayalam Extra"/>
+                <w:color w:val="000000"/>
+                <w:sz w:val="40"/>
+                <w:szCs w:val="40"/>
+              </w:rPr>
+              <w:t>P</w:t>
+            </w:r>
+            <w:r>
+              <w:rPr>
+                <w:rFonts w:ascii="BRH Malayalam Extra" w:hAnsi="BRH Malayalam Extra" w:cs="BRH Malayalam Extra"/>
+                <w:color w:val="000000"/>
+                <w:sz w:val="32"/>
+                <w:szCs w:val="40"/>
+              </w:rPr>
+              <w:t>–</w:t>
+            </w:r>
+            <w:r>
+              <w:rPr>
+                <w:rFonts w:ascii="BRH Malayalam Extra" w:hAnsi="BRH Malayalam Extra" w:cs="BRH Malayalam Extra"/>
+                <w:color w:val="000000"/>
+                <w:sz w:val="40"/>
+                <w:szCs w:val="40"/>
+              </w:rPr>
+              <w:t xml:space="preserve"> ¥s</w:t>
+            </w:r>
+            <w:r>
+              <w:rPr>
+                <w:rFonts w:ascii="BRH Malayalam Extra" w:hAnsi="BRH Malayalam Extra" w:cs="BRH Malayalam Extra"/>
+                <w:color w:val="000000"/>
+                <w:sz w:val="32"/>
+                <w:szCs w:val="40"/>
+              </w:rPr>
+              <w:t>–</w:t>
+            </w:r>
+            <w:r>
+              <w:rPr>
+                <w:rFonts w:ascii="BRH Malayalam Extra" w:hAnsi="BRH Malayalam Extra" w:cs="BRH Malayalam Extra"/>
+                <w:color w:val="000000"/>
+                <w:sz w:val="40"/>
+                <w:szCs w:val="40"/>
+              </w:rPr>
+              <w:t>dx</w:t>
+            </w:r>
+            <w:r>
+              <w:rPr>
+                <w:rFonts w:ascii="BRH Malayalam Extra" w:hAnsi="BRH Malayalam Extra" w:cs="BRH Malayalam Extra"/>
+                <w:color w:val="000000"/>
+                <w:sz w:val="32"/>
+                <w:szCs w:val="40"/>
+              </w:rPr>
+              <w:t>–</w:t>
+            </w:r>
+            <w:r>
+              <w:rPr>
+                <w:rFonts w:ascii="BRH Malayalam Extra" w:hAnsi="BRH Malayalam Extra" w:cs="BRH Malayalam Extra"/>
+                <w:color w:val="000000"/>
+                <w:sz w:val="40"/>
+                <w:szCs w:val="40"/>
+              </w:rPr>
+              <w:t>dy</w:t>
+            </w:r>
+            <w:r>
+              <w:rPr>
+                <w:rFonts w:ascii="BRH Malayalam Extra" w:hAnsi="BRH Malayalam Extra" w:cs="BRH Malayalam Extra"/>
+                <w:color w:val="000000"/>
+                <w:sz w:val="32"/>
+                <w:szCs w:val="40"/>
+              </w:rPr>
+              <w:t>–</w:t>
+            </w:r>
+            <w:r>
+              <w:rPr>
+                <w:rFonts w:ascii="BRH Malayalam Extra" w:hAnsi="BRH Malayalam Extra" w:cs="BRH Malayalam Extra"/>
+                <w:color w:val="000000"/>
+                <w:sz w:val="40"/>
+                <w:szCs w:val="40"/>
+              </w:rPr>
+              <w:t>öMx</w:t>
+            </w:r>
+            <w:r>
+              <w:rPr>
+                <w:rFonts w:ascii="BRH Malayalam Extra" w:hAnsi="BRH Malayalam Extra" w:cs="BRH Malayalam Extra"/>
+                <w:color w:val="000000"/>
+                <w:sz w:val="32"/>
+                <w:szCs w:val="40"/>
+              </w:rPr>
+              <w:t>–</w:t>
+            </w:r>
+            <w:r>
+              <w:rPr>
+                <w:rFonts w:ascii="BRH Malayalam Extra" w:hAnsi="BRH Malayalam Extra" w:cs="BRH Malayalam Extra"/>
+                <w:color w:val="000000"/>
+                <w:sz w:val="40"/>
+                <w:szCs w:val="40"/>
+              </w:rPr>
+              <w:t>i</w:t>
+            </w:r>
+            <w:r>
+              <w:rPr>
+                <w:rFonts w:ascii="BRH Malayalam Extra" w:hAnsi="BRH Malayalam Extra" w:cs="BRH Malayalam Extra"/>
+                <w:color w:val="000000"/>
+                <w:sz w:val="32"/>
+                <w:szCs w:val="40"/>
+              </w:rPr>
+              <w:t>–</w:t>
+            </w:r>
+            <w:r>
+              <w:rPr>
+                <w:rFonts w:ascii="BRH Malayalam Extra" w:hAnsi="BRH Malayalam Extra" w:cs="BRH Malayalam Extra"/>
+                <w:color w:val="000000"/>
+                <w:sz w:val="40"/>
+                <w:szCs w:val="40"/>
+              </w:rPr>
+              <w:t xml:space="preserve">Yõ¦˜ | </w:t>
+            </w:r>
+          </w:p>
+          <w:p>
+            <w:pPr>
+              <w:widowControl w:val="0"/>
+              <w:autoSpaceDE w:val="0"/>
+              <w:autoSpaceDN w:val="0"/>
+              <w:adjustRightInd w:val="0"/>
+              <w:spacing w:before="0" w:line="240" w:lineRule="auto"/>
+              <w:rPr>
+                <w:rFonts w:ascii="BRH Malayalam Extra" w:hAnsi="BRH Malayalam Extra" w:cs="BRH Malayalam Extra"/>
+                <w:color w:val="000000"/>
+                <w:sz w:val="40"/>
+                <w:szCs w:val="40"/>
+              </w:rPr>
+            </w:pPr>
+            <w:r>
+              <w:rPr>
+                <w:rFonts w:ascii="BRH Malayalam Extra" w:hAnsi="BRH Malayalam Extra" w:cs="BRH Malayalam Extra"/>
+                <w:color w:val="000000"/>
+                <w:sz w:val="40"/>
+                <w:szCs w:val="40"/>
+              </w:rPr>
+              <w:t>¥s</w:t>
+            </w:r>
+            <w:r>
+              <w:rPr>
+                <w:rFonts w:ascii="BRH Malayalam Extra" w:hAnsi="BRH Malayalam Extra" w:cs="BRH Malayalam Extra"/>
+                <w:color w:val="000000"/>
+                <w:sz w:val="32"/>
+                <w:szCs w:val="40"/>
+              </w:rPr>
+              <w:t>–</w:t>
+            </w:r>
+            <w:r>
+              <w:rPr>
+                <w:rFonts w:ascii="BRH Malayalam Extra" w:hAnsi="BRH Malayalam Extra" w:cs="BRH Malayalam Extra"/>
+                <w:color w:val="000000"/>
+                <w:sz w:val="40"/>
+                <w:szCs w:val="40"/>
+              </w:rPr>
+              <w:t>dx</w:t>
+            </w:r>
+            <w:r>
+              <w:rPr>
+                <w:rFonts w:ascii="BRH Malayalam Extra" w:hAnsi="BRH Malayalam Extra" w:cs="BRH Malayalam Extra"/>
+                <w:color w:val="000000"/>
+                <w:sz w:val="32"/>
+                <w:szCs w:val="40"/>
+              </w:rPr>
+              <w:t>–</w:t>
+            </w:r>
+            <w:r>
+              <w:rPr>
+                <w:rFonts w:ascii="BRH Malayalam Extra" w:hAnsi="BRH Malayalam Extra" w:cs="BRH Malayalam Extra"/>
+                <w:color w:val="000000"/>
+                <w:sz w:val="40"/>
+                <w:szCs w:val="40"/>
+              </w:rPr>
+              <w:t>dy</w:t>
+            </w:r>
+            <w:r>
+              <w:rPr>
+                <w:rFonts w:ascii="BRH Malayalam Extra" w:hAnsi="BRH Malayalam Extra" w:cs="BRH Malayalam Extra"/>
+                <w:color w:val="000000"/>
+                <w:sz w:val="32"/>
+                <w:szCs w:val="40"/>
+                <w:highlight w:val="yellow"/>
+              </w:rPr>
+              <w:t>–</w:t>
+            </w:r>
+            <w:r>
+              <w:rPr>
+                <w:rFonts w:ascii="BRH Malayalam Extra" w:hAnsi="BRH Malayalam Extra" w:cs="BRH Malayalam Extra"/>
+                <w:color w:val="000000"/>
+                <w:sz w:val="40"/>
+                <w:szCs w:val="40"/>
+                <w:highlight w:val="yellow"/>
+              </w:rPr>
+              <w:t>M</w:t>
+            </w:r>
+            <w:r>
+              <w:rPr>
+                <w:rFonts w:ascii="BRH Malayalam Extra" w:hAnsi="BRH Malayalam Extra" w:cs="BRH Malayalam Extra"/>
+                <w:color w:val="000000"/>
+                <w:sz w:val="40"/>
+                <w:szCs w:val="40"/>
+              </w:rPr>
+              <w:t>x</w:t>
+            </w:r>
+            <w:r>
+              <w:rPr>
+                <w:rFonts w:ascii="BRH Malayalam Extra" w:hAnsi="BRH Malayalam Extra" w:cs="BRH Malayalam Extra"/>
+                <w:color w:val="000000"/>
+                <w:sz w:val="32"/>
+                <w:szCs w:val="40"/>
+              </w:rPr>
+              <w:t>–</w:t>
+            </w:r>
+            <w:r>
+              <w:rPr>
+                <w:rFonts w:ascii="BRH Malayalam Extra" w:hAnsi="BRH Malayalam Extra" w:cs="BRH Malayalam Extra"/>
+                <w:color w:val="000000"/>
+                <w:sz w:val="40"/>
+                <w:szCs w:val="40"/>
+              </w:rPr>
+              <w:t>i</w:t>
+            </w:r>
+            <w:r>
+              <w:rPr>
+                <w:rFonts w:ascii="BRH Malayalam Extra" w:hAnsi="BRH Malayalam Extra" w:cs="BRH Malayalam Extra"/>
+                <w:color w:val="000000"/>
+                <w:sz w:val="32"/>
+                <w:szCs w:val="40"/>
+              </w:rPr>
+              <w:t>–</w:t>
+            </w:r>
+            <w:r>
+              <w:rPr>
+                <w:rFonts w:ascii="BRH Malayalam Extra" w:hAnsi="BRH Malayalam Extra" w:cs="BRH Malayalam Extra"/>
+                <w:color w:val="000000"/>
+                <w:sz w:val="40"/>
+                <w:szCs w:val="40"/>
+              </w:rPr>
+              <w:t xml:space="preserve">Yõ¦— </w:t>
+            </w:r>
+          </w:p>
+          <w:p>
+            <w:pPr>
+              <w:widowControl w:val="0"/>
+              <w:autoSpaceDE w:val="0"/>
+              <w:autoSpaceDN w:val="0"/>
+              <w:adjustRightInd w:val="0"/>
+              <w:spacing w:before="0" w:line="240" w:lineRule="auto"/>
+              <w:rPr>
+                <w:rFonts w:ascii="BRH Malayalam Extra" w:hAnsi="BRH Malayalam Extra" w:cs="BRH Malayalam Extra"/>
+                <w:color w:val="000000"/>
+                <w:sz w:val="40"/>
+                <w:szCs w:val="40"/>
+              </w:rPr>
+            </w:pPr>
+            <w:r>
+              <w:rPr>
+                <w:rFonts w:ascii="BRH Malayalam Extra" w:hAnsi="BRH Malayalam Extra" w:cs="BRH Malayalam Extra"/>
+                <w:color w:val="000000"/>
+                <w:sz w:val="40"/>
+                <w:szCs w:val="40"/>
+              </w:rPr>
+              <w:t>py</w:t>
+            </w:r>
+            <w:r>
+              <w:rPr>
+                <w:rFonts w:ascii="BRH Malayalam Extra" w:hAnsi="BRH Malayalam Extra" w:cs="BRH Malayalam Extra"/>
+                <w:color w:val="000000"/>
+                <w:sz w:val="32"/>
+                <w:szCs w:val="40"/>
+              </w:rPr>
+              <w:t>–</w:t>
+            </w:r>
+            <w:r>
+              <w:rPr>
+                <w:rFonts w:ascii="BRH Malayalam Extra" w:hAnsi="BRH Malayalam Extra" w:cs="BRH Malayalam Extra"/>
+                <w:color w:val="000000"/>
+                <w:sz w:val="40"/>
+                <w:szCs w:val="40"/>
+              </w:rPr>
+              <w:t>qûxPz˜ |</w:t>
+            </w:r>
+          </w:p>
+        </w:tc>
+        <w:tc>
+          <w:tcPr>
+            <w:tcW w:w="5386" w:type="dxa"/>
+          </w:tcPr>
+          <w:p>
+            <w:pPr>
+              <w:widowControl w:val="0"/>
+              <w:autoSpaceDE w:val="0"/>
+              <w:autoSpaceDN w:val="0"/>
+              <w:adjustRightInd w:val="0"/>
+              <w:spacing w:before="0" w:line="240" w:lineRule="auto"/>
+              <w:rPr>
+                <w:rFonts w:ascii="BRH Malayalam Extra" w:hAnsi="BRH Malayalam Extra" w:cs="BRH Malayalam Extra"/>
+                <w:color w:val="000000"/>
+                <w:sz w:val="40"/>
+                <w:szCs w:val="40"/>
+              </w:rPr>
+            </w:pPr>
+            <w:r>
+              <w:rPr>
+                <w:rFonts w:ascii="BRH Malayalam Extra" w:hAnsi="BRH Malayalam Extra" w:cs="BRH Malayalam Extra"/>
+                <w:color w:val="000000"/>
+                <w:sz w:val="40"/>
+                <w:szCs w:val="40"/>
+              </w:rPr>
+              <w:t>P</w:t>
+            </w:r>
+            <w:r>
+              <w:rPr>
+                <w:rFonts w:ascii="BRH Malayalam Extra" w:hAnsi="BRH Malayalam Extra" w:cs="BRH Malayalam Extra"/>
+                <w:color w:val="000000"/>
+                <w:sz w:val="32"/>
+                <w:szCs w:val="40"/>
+              </w:rPr>
+              <w:t>–</w:t>
+            </w:r>
+            <w:r>
+              <w:rPr>
+                <w:rFonts w:ascii="BRH Malayalam Extra" w:hAnsi="BRH Malayalam Extra" w:cs="BRH Malayalam Extra"/>
+                <w:color w:val="000000"/>
+                <w:sz w:val="40"/>
+                <w:szCs w:val="40"/>
+              </w:rPr>
+              <w:t xml:space="preserve"> ¥s</w:t>
+            </w:r>
+            <w:r>
+              <w:rPr>
+                <w:rFonts w:ascii="BRH Malayalam Extra" w:hAnsi="BRH Malayalam Extra" w:cs="BRH Malayalam Extra"/>
+                <w:color w:val="000000"/>
+                <w:sz w:val="32"/>
+                <w:szCs w:val="40"/>
+              </w:rPr>
+              <w:t>–</w:t>
+            </w:r>
+            <w:r>
+              <w:rPr>
+                <w:rFonts w:ascii="BRH Malayalam Extra" w:hAnsi="BRH Malayalam Extra" w:cs="BRH Malayalam Extra"/>
+                <w:color w:val="000000"/>
+                <w:sz w:val="40"/>
+                <w:szCs w:val="40"/>
+              </w:rPr>
+              <w:t>dx</w:t>
+            </w:r>
+            <w:r>
+              <w:rPr>
+                <w:rFonts w:ascii="BRH Malayalam Extra" w:hAnsi="BRH Malayalam Extra" w:cs="BRH Malayalam Extra"/>
+                <w:color w:val="000000"/>
+                <w:sz w:val="32"/>
+                <w:szCs w:val="40"/>
+              </w:rPr>
+              <w:t>–</w:t>
+            </w:r>
+            <w:r>
+              <w:rPr>
+                <w:rFonts w:ascii="BRH Malayalam Extra" w:hAnsi="BRH Malayalam Extra" w:cs="BRH Malayalam Extra"/>
+                <w:color w:val="000000"/>
+                <w:sz w:val="40"/>
+                <w:szCs w:val="40"/>
+              </w:rPr>
+              <w:t>dy</w:t>
+            </w:r>
+            <w:r>
+              <w:rPr>
+                <w:rFonts w:ascii="BRH Malayalam Extra" w:hAnsi="BRH Malayalam Extra" w:cs="BRH Malayalam Extra"/>
+                <w:color w:val="000000"/>
+                <w:sz w:val="32"/>
+                <w:szCs w:val="40"/>
+              </w:rPr>
+              <w:t>–</w:t>
+            </w:r>
+            <w:r>
+              <w:rPr>
+                <w:rFonts w:ascii="BRH Malayalam Extra" w:hAnsi="BRH Malayalam Extra" w:cs="BRH Malayalam Extra"/>
+                <w:color w:val="000000"/>
+                <w:sz w:val="40"/>
+                <w:szCs w:val="40"/>
+              </w:rPr>
+              <w:t>öMx</w:t>
+            </w:r>
+            <w:r>
+              <w:rPr>
+                <w:rFonts w:ascii="BRH Malayalam Extra" w:hAnsi="BRH Malayalam Extra" w:cs="BRH Malayalam Extra"/>
+                <w:color w:val="000000"/>
+                <w:sz w:val="32"/>
+                <w:szCs w:val="40"/>
+              </w:rPr>
+              <w:t>–</w:t>
+            </w:r>
+            <w:r>
+              <w:rPr>
+                <w:rFonts w:ascii="BRH Malayalam Extra" w:hAnsi="BRH Malayalam Extra" w:cs="BRH Malayalam Extra"/>
+                <w:color w:val="000000"/>
+                <w:sz w:val="40"/>
+                <w:szCs w:val="40"/>
+              </w:rPr>
+              <w:t>i</w:t>
+            </w:r>
+            <w:r>
+              <w:rPr>
+                <w:rFonts w:ascii="BRH Malayalam Extra" w:hAnsi="BRH Malayalam Extra" w:cs="BRH Malayalam Extra"/>
+                <w:color w:val="000000"/>
+                <w:sz w:val="32"/>
+                <w:szCs w:val="40"/>
+              </w:rPr>
+              <w:t>–</w:t>
+            </w:r>
+            <w:r>
+              <w:rPr>
+                <w:rFonts w:ascii="BRH Malayalam Extra" w:hAnsi="BRH Malayalam Extra" w:cs="BRH Malayalam Extra"/>
+                <w:color w:val="000000"/>
+                <w:sz w:val="40"/>
+                <w:szCs w:val="40"/>
+              </w:rPr>
+              <w:t xml:space="preserve">Yõ¦˜ | </w:t>
+            </w:r>
+          </w:p>
+          <w:p>
+            <w:pPr>
+              <w:widowControl w:val="0"/>
+              <w:autoSpaceDE w:val="0"/>
+              <w:autoSpaceDN w:val="0"/>
+              <w:adjustRightInd w:val="0"/>
+              <w:spacing w:before="0" w:line="240" w:lineRule="auto"/>
+              <w:rPr>
+                <w:rFonts w:ascii="BRH Malayalam Extra" w:hAnsi="BRH Malayalam Extra" w:cs="BRH Malayalam Extra"/>
+                <w:color w:val="000000"/>
+                <w:sz w:val="40"/>
+                <w:szCs w:val="40"/>
+              </w:rPr>
+            </w:pPr>
+            <w:r>
+              <w:rPr>
+                <w:rFonts w:ascii="BRH Malayalam Extra" w:hAnsi="BRH Malayalam Extra" w:cs="BRH Malayalam Extra"/>
+                <w:color w:val="000000"/>
+                <w:sz w:val="40"/>
+                <w:szCs w:val="40"/>
+              </w:rPr>
+              <w:t>¥s</w:t>
+            </w:r>
+            <w:r>
+              <w:rPr>
+                <w:rFonts w:ascii="BRH Malayalam Extra" w:hAnsi="BRH Malayalam Extra" w:cs="BRH Malayalam Extra"/>
+                <w:color w:val="000000"/>
+                <w:sz w:val="32"/>
+                <w:szCs w:val="40"/>
+              </w:rPr>
+              <w:t>–</w:t>
+            </w:r>
+            <w:r>
+              <w:rPr>
+                <w:rFonts w:ascii="BRH Malayalam Extra" w:hAnsi="BRH Malayalam Extra" w:cs="BRH Malayalam Extra"/>
+                <w:color w:val="000000"/>
+                <w:sz w:val="40"/>
+                <w:szCs w:val="40"/>
+              </w:rPr>
+              <w:t>dx</w:t>
+            </w:r>
+            <w:r>
+              <w:rPr>
+                <w:rFonts w:ascii="BRH Malayalam Extra" w:hAnsi="BRH Malayalam Extra" w:cs="BRH Malayalam Extra"/>
+                <w:color w:val="000000"/>
+                <w:sz w:val="32"/>
+                <w:szCs w:val="40"/>
+              </w:rPr>
+              <w:t>–</w:t>
+            </w:r>
+            <w:r>
+              <w:rPr>
+                <w:rFonts w:ascii="BRH Malayalam Extra" w:hAnsi="BRH Malayalam Extra" w:cs="BRH Malayalam Extra"/>
+                <w:color w:val="000000"/>
+                <w:sz w:val="40"/>
+                <w:szCs w:val="40"/>
+              </w:rPr>
+              <w:t>dy</w:t>
+            </w:r>
+            <w:r>
+              <w:rPr>
+                <w:rFonts w:ascii="BRH Malayalam Extra" w:hAnsi="BRH Malayalam Extra" w:cs="BRH Malayalam Extra"/>
+                <w:color w:val="000000"/>
+                <w:sz w:val="32"/>
+                <w:szCs w:val="40"/>
+                <w:highlight w:val="green"/>
+              </w:rPr>
+              <w:t>––</w:t>
+            </w:r>
+            <w:r>
+              <w:rPr>
+                <w:rFonts w:ascii="BRH Malayalam Extra" w:hAnsi="BRH Malayalam Extra" w:cs="BRH Malayalam Extra"/>
+                <w:color w:val="000000"/>
+                <w:sz w:val="40"/>
+                <w:szCs w:val="40"/>
+                <w:highlight w:val="green"/>
+              </w:rPr>
+              <w:t>ö</w:t>
+            </w:r>
+            <w:r>
+              <w:rPr>
+                <w:rFonts w:ascii="BRH Malayalam Extra" w:hAnsi="BRH Malayalam Extra" w:cs="BRH Malayalam Extra"/>
+                <w:color w:val="000000"/>
+                <w:sz w:val="40"/>
+                <w:szCs w:val="40"/>
+              </w:rPr>
+              <w:t>Mx</w:t>
+            </w:r>
+            <w:r>
+              <w:rPr>
+                <w:rFonts w:ascii="BRH Malayalam Extra" w:hAnsi="BRH Malayalam Extra" w:cs="BRH Malayalam Extra"/>
+                <w:color w:val="000000"/>
+                <w:sz w:val="32"/>
+                <w:szCs w:val="40"/>
+              </w:rPr>
+              <w:t>–</w:t>
+            </w:r>
+            <w:r>
+              <w:rPr>
+                <w:rFonts w:ascii="BRH Malayalam Extra" w:hAnsi="BRH Malayalam Extra" w:cs="BRH Malayalam Extra"/>
+                <w:color w:val="000000"/>
+                <w:sz w:val="40"/>
+                <w:szCs w:val="40"/>
+              </w:rPr>
+              <w:t>i</w:t>
+            </w:r>
+            <w:r>
+              <w:rPr>
+                <w:rFonts w:ascii="BRH Malayalam Extra" w:hAnsi="BRH Malayalam Extra" w:cs="BRH Malayalam Extra"/>
+                <w:color w:val="000000"/>
+                <w:sz w:val="32"/>
+                <w:szCs w:val="40"/>
+              </w:rPr>
+              <w:t>–</w:t>
+            </w:r>
+            <w:r>
+              <w:rPr>
+                <w:rFonts w:ascii="BRH Malayalam Extra" w:hAnsi="BRH Malayalam Extra" w:cs="BRH Malayalam Extra"/>
+                <w:color w:val="000000"/>
+                <w:sz w:val="40"/>
+                <w:szCs w:val="40"/>
+              </w:rPr>
+              <w:t xml:space="preserve">Yõ¦— </w:t>
+            </w:r>
+          </w:p>
+          <w:p>
+            <w:pPr>
+              <w:widowControl w:val="0"/>
+              <w:autoSpaceDE w:val="0"/>
+              <w:autoSpaceDN w:val="0"/>
+              <w:adjustRightInd w:val="0"/>
+              <w:spacing w:before="0" w:line="240" w:lineRule="auto"/>
+              <w:rPr>
+                <w:rFonts w:ascii="BRH Malayalam Extra" w:hAnsi="BRH Malayalam Extra" w:cs="BRH Malayalam Extra"/>
+                <w:color w:val="000000"/>
+                <w:sz w:val="40"/>
+                <w:szCs w:val="40"/>
+              </w:rPr>
+            </w:pPr>
+            <w:r>
+              <w:rPr>
+                <w:rFonts w:ascii="BRH Malayalam Extra" w:hAnsi="BRH Malayalam Extra" w:cs="BRH Malayalam Extra"/>
+                <w:color w:val="000000"/>
+                <w:sz w:val="40"/>
+                <w:szCs w:val="40"/>
+              </w:rPr>
+              <w:t>py</w:t>
+            </w:r>
+            <w:r>
+              <w:rPr>
+                <w:rFonts w:ascii="BRH Malayalam Extra" w:hAnsi="BRH Malayalam Extra" w:cs="BRH Malayalam Extra"/>
+                <w:color w:val="000000"/>
+                <w:sz w:val="32"/>
+                <w:szCs w:val="40"/>
+              </w:rPr>
+              <w:t>–</w:t>
+            </w:r>
+            <w:r>
+              <w:rPr>
+                <w:rFonts w:ascii="BRH Malayalam Extra" w:hAnsi="BRH Malayalam Extra" w:cs="BRH Malayalam Extra"/>
+                <w:color w:val="000000"/>
+                <w:sz w:val="40"/>
+                <w:szCs w:val="40"/>
+              </w:rPr>
+              <w:t>qûxPz˜ |</w:t>
+            </w:r>
+          </w:p>
+        </w:tc>
+      </w:tr>
+      <w:tr>
+        <w:trPr>
+          <w:trHeight w:val="1671"/>
+        </w:trPr>
+        <w:tc>
+          <w:tcPr>
+            <w:tcW w:w="3906" w:type="dxa"/>
+          </w:tcPr>
+          <w:p>
+            <w:pPr>
+              <w:widowControl w:val="0"/>
+              <w:tabs>
+                <w:tab w:val="left" w:pos="993"/>
+              </w:tabs>
+              <w:autoSpaceDE w:val="0"/>
+              <w:autoSpaceDN w:val="0"/>
+              <w:adjustRightInd w:val="0"/>
+              <w:spacing w:before="0" w:line="240" w:lineRule="auto"/>
+              <w:ind w:right="297"/>
+              <w:rPr>
+                <w:rFonts w:cs="Arial"/>
+                <w:b/>
+                <w:sz w:val="28"/>
+                <w:szCs w:val="32"/>
+              </w:rPr>
+            </w:pPr>
+            <w:r>
+              <w:rPr>
+                <w:rFonts w:cs="Arial"/>
+                <w:b/>
+                <w:sz w:val="28"/>
+                <w:szCs w:val="32"/>
+              </w:rPr>
               <w:t>T.S.4.4.4</w:t>
             </w:r>
             <w:r>
@@ -1255,6 +1992,570 @@
                 <w:szCs w:val="40"/>
               </w:rPr>
               <w:t>ixs—J |</w:t>
+            </w:r>
+          </w:p>
+        </w:tc>
+      </w:tr>
+      <w:tr>
+        <w:trPr>
+          <w:trHeight w:val="1536"/>
+        </w:trPr>
+        <w:tc>
+          <w:tcPr>
+            <w:tcW w:w="3906" w:type="dxa"/>
+          </w:tcPr>
+          <w:p>
+            <w:pPr>
+              <w:widowControl w:val="0"/>
+              <w:tabs>
+                <w:tab w:val="left" w:pos="993"/>
+              </w:tabs>
+              <w:autoSpaceDE w:val="0"/>
+              <w:autoSpaceDN w:val="0"/>
+              <w:adjustRightInd w:val="0"/>
+              <w:spacing w:before="0" w:line="240" w:lineRule="auto"/>
+              <w:ind w:right="297"/>
+              <w:rPr>
+                <w:rFonts w:cs="Arial"/>
+                <w:b/>
+                <w:sz w:val="28"/>
+                <w:szCs w:val="32"/>
+              </w:rPr>
+            </w:pPr>
+            <w:r>
+              <w:rPr>
+                <w:rFonts w:cs="Arial"/>
+                <w:b/>
+                <w:sz w:val="28"/>
+                <w:szCs w:val="32"/>
+              </w:rPr>
+              <w:t>T.S.4.4.</w:t>
+            </w:r>
+            <w:r>
+              <w:rPr>
+                <w:rFonts w:cs="Arial"/>
+                <w:b/>
+                <w:sz w:val="28"/>
+                <w:szCs w:val="32"/>
+              </w:rPr>
+              <w:t>9.1</w:t>
+            </w:r>
+            <w:r>
+              <w:rPr>
+                <w:rFonts w:cs="Arial"/>
+                <w:b/>
+                <w:sz w:val="28"/>
+                <w:szCs w:val="32"/>
+              </w:rPr>
+              <w:t xml:space="preserve"> – Kramam</w:t>
+            </w:r>
+          </w:p>
+          <w:p>
+            <w:pPr>
+              <w:widowControl w:val="0"/>
+              <w:tabs>
+                <w:tab w:val="left" w:pos="993"/>
+              </w:tabs>
+              <w:autoSpaceDE w:val="0"/>
+              <w:autoSpaceDN w:val="0"/>
+              <w:adjustRightInd w:val="0"/>
+              <w:spacing w:before="0" w:line="240" w:lineRule="auto"/>
+              <w:ind w:right="297"/>
+              <w:rPr>
+                <w:rFonts w:cs="Arial"/>
+                <w:b/>
+                <w:sz w:val="28"/>
+                <w:szCs w:val="32"/>
+              </w:rPr>
+            </w:pPr>
+            <w:r>
+              <w:rPr>
+                <w:rFonts w:cs="Arial"/>
+                <w:b/>
+                <w:sz w:val="28"/>
+                <w:szCs w:val="32"/>
+              </w:rPr>
+              <w:t xml:space="preserve">Krama Vaakyam No.– </w:t>
+            </w:r>
+            <w:r>
+              <w:rPr>
+                <w:rFonts w:cs="Arial"/>
+                <w:b/>
+                <w:sz w:val="28"/>
+                <w:szCs w:val="32"/>
+              </w:rPr>
+              <w:t>58</w:t>
+            </w:r>
+          </w:p>
+          <w:p>
+            <w:pPr>
+              <w:widowControl w:val="0"/>
+              <w:tabs>
+                <w:tab w:val="left" w:pos="993"/>
+              </w:tabs>
+              <w:autoSpaceDE w:val="0"/>
+              <w:autoSpaceDN w:val="0"/>
+              <w:adjustRightInd w:val="0"/>
+              <w:spacing w:before="0" w:line="240" w:lineRule="auto"/>
+              <w:ind w:right="297"/>
+              <w:rPr>
+                <w:rFonts w:cs="Arial"/>
+                <w:b/>
+                <w:sz w:val="28"/>
+                <w:szCs w:val="32"/>
+              </w:rPr>
+            </w:pPr>
+            <w:r>
+              <w:rPr>
+                <w:rFonts w:cs="Arial"/>
+                <w:b/>
+                <w:sz w:val="28"/>
+                <w:szCs w:val="32"/>
+              </w:rPr>
+              <w:t>Panchaati No</w:t>
+            </w:r>
+            <w:r>
+              <w:rPr>
+                <w:rFonts w:cs="Arial"/>
+                <w:b/>
+                <w:szCs w:val="32"/>
+              </w:rPr>
+              <w:t xml:space="preserve">. - </w:t>
+            </w:r>
+            <w:r>
+              <w:rPr>
+                <w:rFonts w:cs="Arial"/>
+                <w:b/>
+                <w:szCs w:val="32"/>
+              </w:rPr>
+              <w:t>25</w:t>
+            </w:r>
+          </w:p>
+        </w:tc>
+        <w:tc>
+          <w:tcPr>
+            <w:tcW w:w="5103" w:type="dxa"/>
+          </w:tcPr>
+          <w:p>
+            <w:pPr>
+              <w:widowControl w:val="0"/>
+              <w:autoSpaceDE w:val="0"/>
+              <w:autoSpaceDN w:val="0"/>
+              <w:adjustRightInd w:val="0"/>
+              <w:spacing w:line="252" w:lineRule="auto"/>
+              <w:rPr>
+                <w:rFonts w:ascii="BRH Malayalam Extra" w:hAnsi="BRH Malayalam Extra" w:cs="BRH Malayalam Extra"/>
+                <w:color w:val="000000"/>
+                <w:sz w:val="40"/>
+                <w:szCs w:val="40"/>
+                <w:lang w:val="it-IT"/>
+              </w:rPr>
+            </w:pPr>
+            <w:r>
+              <w:rPr>
+                <w:rFonts w:ascii="BRH Malayalam Extra" w:hAnsi="BRH Malayalam Extra" w:cs="BRH Malayalam Extra"/>
+                <w:color w:val="000000"/>
+                <w:sz w:val="40"/>
+                <w:szCs w:val="40"/>
+                <w:lang w:val="it-IT"/>
+              </w:rPr>
+              <w:t>A</w:t>
+            </w:r>
+            <w:r>
+              <w:rPr>
+                <w:rFonts w:ascii="BRH Malayalam Extra" w:hAnsi="BRH Malayalam Extra" w:cs="BRH Malayalam Extra"/>
+                <w:color w:val="000000"/>
+                <w:sz w:val="32"/>
+                <w:szCs w:val="40"/>
+                <w:lang w:val="it-IT"/>
+              </w:rPr>
+              <w:t>–</w:t>
+            </w:r>
+            <w:r>
+              <w:rPr>
+                <w:rFonts w:ascii="BRH Malayalam Extra" w:hAnsi="BRH Malayalam Extra" w:cs="BRH Malayalam Extra"/>
+                <w:color w:val="000000"/>
+                <w:sz w:val="40"/>
+                <w:szCs w:val="40"/>
+                <w:lang w:val="it-IT"/>
+              </w:rPr>
+              <w:t>hyr¡—¥Zx„e¢Z</w:t>
+            </w:r>
+            <w:r>
+              <w:rPr>
+                <w:rFonts w:ascii="BRH Malayalam Extra" w:hAnsi="BRH Malayalam Extra" w:cs="BRH Malayalam Extra"/>
+                <w:color w:val="000000"/>
+                <w:sz w:val="32"/>
+                <w:szCs w:val="40"/>
+                <w:lang w:val="it-IT"/>
+              </w:rPr>
+              <w:t>–</w:t>
+            </w:r>
+            <w:r>
+              <w:rPr>
+                <w:rFonts w:ascii="BRH Malayalam Extra" w:hAnsi="BRH Malayalam Extra" w:cs="BRH Malayalam Extra"/>
+                <w:color w:val="000000"/>
+                <w:sz w:val="40"/>
+                <w:szCs w:val="40"/>
+                <w:lang w:val="it-IT"/>
+              </w:rPr>
+              <w:t xml:space="preserve">exJ | </w:t>
+            </w:r>
+          </w:p>
+          <w:p>
+            <w:pPr>
+              <w:widowControl w:val="0"/>
+              <w:autoSpaceDE w:val="0"/>
+              <w:autoSpaceDN w:val="0"/>
+              <w:adjustRightInd w:val="0"/>
+              <w:spacing w:before="0" w:line="240" w:lineRule="auto"/>
+              <w:rPr>
+                <w:rFonts w:ascii="BRH Malayalam Extra" w:hAnsi="BRH Malayalam Extra" w:cs="BRH Malayalam Extra"/>
+                <w:color w:val="000000"/>
+                <w:sz w:val="40"/>
+                <w:szCs w:val="40"/>
+                <w:lang w:val="it-IT"/>
+              </w:rPr>
+            </w:pPr>
+            <w:r>
+              <w:rPr>
+                <w:rFonts w:ascii="BRH Malayalam Extra" w:hAnsi="BRH Malayalam Extra" w:cs="BRH Malayalam Extra"/>
+                <w:color w:val="000000"/>
+                <w:sz w:val="40"/>
+                <w:szCs w:val="40"/>
+                <w:lang w:val="it-IT"/>
+              </w:rPr>
+              <w:t>A</w:t>
+            </w:r>
+            <w:r>
+              <w:rPr>
+                <w:rFonts w:ascii="BRH Malayalam Extra" w:hAnsi="BRH Malayalam Extra" w:cs="BRH Malayalam Extra"/>
+                <w:color w:val="000000"/>
+                <w:sz w:val="32"/>
+                <w:szCs w:val="40"/>
+                <w:highlight w:val="yellow"/>
+                <w:lang w:val="it-IT"/>
+              </w:rPr>
+              <w:t>–</w:t>
+            </w:r>
+            <w:r>
+              <w:rPr>
+                <w:rFonts w:ascii="BRH Malayalam Extra" w:hAnsi="BRH Malayalam Extra" w:cs="BRH Malayalam Extra"/>
+                <w:color w:val="000000"/>
+                <w:sz w:val="40"/>
+                <w:szCs w:val="40"/>
+                <w:highlight w:val="yellow"/>
+                <w:lang w:val="it-IT"/>
+              </w:rPr>
+              <w:t>hy</w:t>
+            </w:r>
+            <w:r>
+              <w:rPr>
+                <w:rFonts w:ascii="BRH Malayalam Extra" w:hAnsi="BRH Malayalam Extra" w:cs="BRH Malayalam Extra"/>
+                <w:color w:val="000000"/>
+                <w:sz w:val="40"/>
+                <w:szCs w:val="40"/>
+                <w:lang w:val="it-IT"/>
+              </w:rPr>
+              <w:t>—r¡Z</w:t>
+            </w:r>
+            <w:r>
+              <w:rPr>
+                <w:rFonts w:ascii="BRH Malayalam Extra" w:hAnsi="BRH Malayalam Extra" w:cs="BRH Malayalam Extra"/>
+                <w:color w:val="000000"/>
+                <w:sz w:val="32"/>
+                <w:szCs w:val="40"/>
+                <w:lang w:val="it-IT"/>
+              </w:rPr>
+              <w:t>–</w:t>
+            </w:r>
+            <w:r>
+              <w:rPr>
+                <w:rFonts w:ascii="BRH Malayalam Extra" w:hAnsi="BRH Malayalam Extra" w:cs="BRH Malayalam Extra"/>
+                <w:color w:val="000000"/>
+                <w:sz w:val="40"/>
+                <w:szCs w:val="40"/>
+                <w:lang w:val="it-IT"/>
+              </w:rPr>
+              <w:t xml:space="preserve"> CZõ</w:t>
+            </w:r>
+            <w:r>
+              <w:rPr>
+                <w:rFonts w:ascii="BRH Malayalam Extra" w:hAnsi="BRH Malayalam Extra" w:cs="BRH Malayalam Extra"/>
+                <w:color w:val="000000"/>
+                <w:sz w:val="32"/>
+                <w:szCs w:val="40"/>
+                <w:lang w:val="it-IT"/>
+              </w:rPr>
+              <w:t>–</w:t>
+            </w:r>
+            <w:r>
+              <w:rPr>
+                <w:rFonts w:ascii="BRH Malayalam Extra" w:hAnsi="BRH Malayalam Extra" w:cs="BRH Malayalam Extra"/>
+                <w:color w:val="000000"/>
+                <w:sz w:val="40"/>
+                <w:szCs w:val="40"/>
+                <w:lang w:val="it-IT"/>
+              </w:rPr>
+              <w:t>hy - s¡</w:t>
+            </w:r>
+            <w:r>
+              <w:rPr>
+                <w:rFonts w:ascii="BRH Malayalam Extra" w:hAnsi="BRH Malayalam Extra" w:cs="BRH Malayalam Extra"/>
+                <w:color w:val="000000"/>
+                <w:sz w:val="32"/>
+                <w:szCs w:val="40"/>
+                <w:lang w:val="it-IT"/>
+              </w:rPr>
+              <w:t>–</w:t>
+            </w:r>
+            <w:r>
+              <w:rPr>
+                <w:rFonts w:ascii="BRH Malayalam Extra" w:hAnsi="BRH Malayalam Extra" w:cs="BRH Malayalam Extra"/>
+                <w:color w:val="000000"/>
+                <w:sz w:val="40"/>
+                <w:szCs w:val="40"/>
+                <w:lang w:val="it-IT"/>
+              </w:rPr>
+              <w:t>Z</w:t>
+            </w:r>
+            <w:r>
+              <w:rPr>
+                <w:rFonts w:ascii="BRH Malayalam Extra" w:hAnsi="BRH Malayalam Extra" w:cs="BRH Malayalam Extra"/>
+                <w:color w:val="000000"/>
+                <w:sz w:val="32"/>
+                <w:szCs w:val="40"/>
+                <w:lang w:val="it-IT"/>
+              </w:rPr>
+              <w:t>–</w:t>
+            </w:r>
+            <w:r>
+              <w:rPr>
+                <w:rFonts w:ascii="BRH Malayalam Extra" w:hAnsi="BRH Malayalam Extra" w:cs="BRH Malayalam Extra"/>
+                <w:color w:val="000000"/>
+                <w:sz w:val="40"/>
+                <w:szCs w:val="40"/>
+                <w:lang w:val="it-IT"/>
+              </w:rPr>
+              <w:t>J |</w:t>
+            </w:r>
+          </w:p>
+        </w:tc>
+        <w:tc>
+          <w:tcPr>
+            <w:tcW w:w="5386" w:type="dxa"/>
+          </w:tcPr>
+          <w:p>
+            <w:pPr>
+              <w:widowControl w:val="0"/>
+              <w:autoSpaceDE w:val="0"/>
+              <w:autoSpaceDN w:val="0"/>
+              <w:adjustRightInd w:val="0"/>
+              <w:spacing w:line="252" w:lineRule="auto"/>
+              <w:rPr>
+                <w:rFonts w:ascii="BRH Malayalam Extra" w:hAnsi="BRH Malayalam Extra" w:cs="BRH Malayalam Extra"/>
+                <w:color w:val="000000"/>
+                <w:sz w:val="40"/>
+                <w:szCs w:val="40"/>
+                <w:lang w:val="it-IT"/>
+              </w:rPr>
+            </w:pPr>
+            <w:r>
+              <w:rPr>
+                <w:rFonts w:ascii="BRH Malayalam Extra" w:hAnsi="BRH Malayalam Extra" w:cs="BRH Malayalam Extra"/>
+                <w:color w:val="000000"/>
+                <w:sz w:val="40"/>
+                <w:szCs w:val="40"/>
+                <w:lang w:val="it-IT"/>
+              </w:rPr>
+              <w:t>A</w:t>
+            </w:r>
+            <w:r>
+              <w:rPr>
+                <w:rFonts w:ascii="BRH Malayalam Extra" w:hAnsi="BRH Malayalam Extra" w:cs="BRH Malayalam Extra"/>
+                <w:color w:val="000000"/>
+                <w:sz w:val="32"/>
+                <w:szCs w:val="40"/>
+                <w:lang w:val="it-IT"/>
+              </w:rPr>
+              <w:t>–</w:t>
+            </w:r>
+            <w:r>
+              <w:rPr>
+                <w:rFonts w:ascii="BRH Malayalam Extra" w:hAnsi="BRH Malayalam Extra" w:cs="BRH Malayalam Extra"/>
+                <w:color w:val="000000"/>
+                <w:sz w:val="40"/>
+                <w:szCs w:val="40"/>
+                <w:lang w:val="it-IT"/>
+              </w:rPr>
+              <w:t>hyr¡—¥Zx„e¢Z</w:t>
+            </w:r>
+            <w:r>
+              <w:rPr>
+                <w:rFonts w:ascii="BRH Malayalam Extra" w:hAnsi="BRH Malayalam Extra" w:cs="BRH Malayalam Extra"/>
+                <w:color w:val="000000"/>
+                <w:sz w:val="32"/>
+                <w:szCs w:val="40"/>
+                <w:lang w:val="it-IT"/>
+              </w:rPr>
+              <w:t>–</w:t>
+            </w:r>
+            <w:r>
+              <w:rPr>
+                <w:rFonts w:ascii="BRH Malayalam Extra" w:hAnsi="BRH Malayalam Extra" w:cs="BRH Malayalam Extra"/>
+                <w:color w:val="000000"/>
+                <w:sz w:val="40"/>
+                <w:szCs w:val="40"/>
+                <w:lang w:val="it-IT"/>
+              </w:rPr>
+              <w:t xml:space="preserve">exJ | </w:t>
+            </w:r>
+          </w:p>
+          <w:p>
+            <w:pPr>
+              <w:widowControl w:val="0"/>
+              <w:autoSpaceDE w:val="0"/>
+              <w:autoSpaceDN w:val="0"/>
+              <w:adjustRightInd w:val="0"/>
+              <w:spacing w:before="0" w:line="240" w:lineRule="auto"/>
+              <w:rPr>
+                <w:rFonts w:ascii="BRH Malayalam Extra" w:hAnsi="BRH Malayalam Extra" w:cs="BRH Malayalam Extra"/>
+                <w:color w:val="000000"/>
+                <w:sz w:val="40"/>
+                <w:szCs w:val="40"/>
+                <w:lang w:val="it-IT"/>
+              </w:rPr>
+            </w:pPr>
+            <w:r>
+              <w:rPr>
+                <w:rFonts w:ascii="BRH Malayalam Extra" w:hAnsi="BRH Malayalam Extra" w:cs="BRH Malayalam Extra"/>
+                <w:color w:val="000000"/>
+                <w:sz w:val="40"/>
+                <w:szCs w:val="40"/>
+                <w:lang w:val="it-IT"/>
+              </w:rPr>
+              <w:t>A</w:t>
+            </w:r>
+            <w:r>
+              <w:rPr>
+                <w:rFonts w:ascii="BRH Malayalam Extra" w:hAnsi="BRH Malayalam Extra" w:cs="BRH Malayalam Extra"/>
+                <w:color w:val="000000"/>
+                <w:sz w:val="32"/>
+                <w:szCs w:val="40"/>
+                <w:lang w:val="it-IT"/>
+              </w:rPr>
+              <w:t>–</w:t>
+            </w:r>
+            <w:r>
+              <w:rPr>
+                <w:rFonts w:ascii="BRH Malayalam Extra" w:hAnsi="BRH Malayalam Extra" w:cs="BRH Malayalam Extra"/>
+                <w:color w:val="000000"/>
+                <w:sz w:val="40"/>
+                <w:szCs w:val="40"/>
+                <w:lang w:val="it-IT"/>
+              </w:rPr>
+              <w:t>hy</w:t>
+            </w:r>
+            <w:r>
+              <w:rPr>
+                <w:rFonts w:ascii="BRH Malayalam Extra" w:hAnsi="BRH Malayalam Extra" w:cs="BRH Malayalam Extra"/>
+                <w:color w:val="000000"/>
+                <w:sz w:val="40"/>
+                <w:szCs w:val="40"/>
+                <w:highlight w:val="green"/>
+                <w:lang w:val="it-IT"/>
+              </w:rPr>
+              <w:t>r¡—</w:t>
+            </w:r>
+            <w:r>
+              <w:rPr>
+                <w:rFonts w:ascii="BRH Malayalam Extra" w:hAnsi="BRH Malayalam Extra" w:cs="BRH Malayalam Extra"/>
+                <w:color w:val="000000"/>
+                <w:sz w:val="40"/>
+                <w:szCs w:val="40"/>
+                <w:lang w:val="it-IT"/>
+              </w:rPr>
+              <w:t>Z</w:t>
+            </w:r>
+            <w:r>
+              <w:rPr>
+                <w:rFonts w:ascii="BRH Malayalam Extra" w:hAnsi="BRH Malayalam Extra" w:cs="BRH Malayalam Extra"/>
+                <w:color w:val="000000"/>
+                <w:sz w:val="32"/>
+                <w:szCs w:val="40"/>
+                <w:lang w:val="it-IT"/>
+              </w:rPr>
+              <w:t>–</w:t>
+            </w:r>
+            <w:r>
+              <w:rPr>
+                <w:rFonts w:ascii="BRH Malayalam Extra" w:hAnsi="BRH Malayalam Extra" w:cs="BRH Malayalam Extra"/>
+                <w:color w:val="000000"/>
+                <w:sz w:val="40"/>
+                <w:szCs w:val="40"/>
+                <w:lang w:val="it-IT"/>
+              </w:rPr>
+              <w:t xml:space="preserve"> CZõ</w:t>
+            </w:r>
+            <w:r>
+              <w:rPr>
+                <w:rFonts w:ascii="BRH Malayalam Extra" w:hAnsi="BRH Malayalam Extra" w:cs="BRH Malayalam Extra"/>
+                <w:color w:val="000000"/>
+                <w:sz w:val="32"/>
+                <w:szCs w:val="40"/>
+                <w:lang w:val="it-IT"/>
+              </w:rPr>
+              <w:t>–</w:t>
+            </w:r>
+            <w:r>
+              <w:rPr>
+                <w:rFonts w:ascii="BRH Malayalam Extra" w:hAnsi="BRH Malayalam Extra" w:cs="BRH Malayalam Extra"/>
+                <w:color w:val="000000"/>
+                <w:sz w:val="40"/>
+                <w:szCs w:val="40"/>
+                <w:lang w:val="it-IT"/>
+              </w:rPr>
+              <w:t>hy - s¡</w:t>
+            </w:r>
+            <w:r>
+              <w:rPr>
+                <w:rFonts w:ascii="BRH Malayalam Extra" w:hAnsi="BRH Malayalam Extra" w:cs="BRH Malayalam Extra"/>
+                <w:color w:val="000000"/>
+                <w:sz w:val="32"/>
+                <w:szCs w:val="40"/>
+                <w:lang w:val="it-IT"/>
+              </w:rPr>
+              <w:t>–</w:t>
+            </w:r>
+            <w:r>
+              <w:rPr>
+                <w:rFonts w:ascii="BRH Malayalam Extra" w:hAnsi="BRH Malayalam Extra" w:cs="BRH Malayalam Extra"/>
+                <w:color w:val="000000"/>
+                <w:sz w:val="40"/>
+                <w:szCs w:val="40"/>
+                <w:lang w:val="it-IT"/>
+              </w:rPr>
+              <w:t>Z</w:t>
+            </w:r>
+            <w:r>
+              <w:rPr>
+                <w:rFonts w:ascii="BRH Malayalam Extra" w:hAnsi="BRH Malayalam Extra" w:cs="BRH Malayalam Extra"/>
+                <w:color w:val="000000"/>
+                <w:sz w:val="32"/>
+                <w:szCs w:val="40"/>
+                <w:lang w:val="it-IT"/>
+              </w:rPr>
+              <w:t>–</w:t>
+            </w:r>
+            <w:r>
+              <w:rPr>
+                <w:rFonts w:ascii="BRH Malayalam Extra" w:hAnsi="BRH Malayalam Extra" w:cs="BRH Malayalam Extra"/>
+                <w:color w:val="000000"/>
+                <w:sz w:val="40"/>
+                <w:szCs w:val="40"/>
+                <w:lang w:val="it-IT"/>
+              </w:rPr>
+              <w:t>J |</w:t>
             </w:r>
           </w:p>
         </w:tc>
@@ -1494,7 +2795,6 @@
                 <w:sz w:val="32"/>
                 <w:szCs w:val="32"/>
               </w:rPr>
-              <w:lastRenderedPageBreak/>
               <w:t>Reference</w:t>
             </w:r>
           </w:p>
@@ -1517,7 +2817,6 @@
                 <w:sz w:val="32"/>
                 <w:szCs w:val="32"/>
               </w:rPr>
-              <w:lastRenderedPageBreak/>
               <w:t>As Printed</w:t>
             </w:r>
           </w:p>
@@ -3002,6 +4301,7 @@
                 <w:sz w:val="32"/>
                 <w:szCs w:val="32"/>
               </w:rPr>
+              <w:lastRenderedPageBreak/>
               <w:t>Reference</w:t>
             </w:r>
           </w:p>
@@ -3024,6 +4324,7 @@
                 <w:sz w:val="32"/>
                 <w:szCs w:val="32"/>
               </w:rPr>
+              <w:lastRenderedPageBreak/>
               <w:t>As Printed</w:t>
             </w:r>
           </w:p>
@@ -3831,7 +5132,6 @@
                 <w:sz w:val="28"/>
                 <w:szCs w:val="32"/>
               </w:rPr>
-              <w:lastRenderedPageBreak/>
               <w:t>T.S.4.4.2.1 – Kramam</w:t>
             </w:r>
           </w:p>
@@ -5269,6 +6569,7 @@
                 <w:sz w:val="40"/>
                 <w:szCs w:val="40"/>
               </w:rPr>
+              <w:lastRenderedPageBreak/>
               <w:t>Aky—ræ¥diyÒ |</w:t>
             </w:r>
             <w:r>
@@ -5308,6 +6609,7 @@
                 <w:szCs w:val="40"/>
                 <w:highlight w:val="green"/>
               </w:rPr>
+              <w:lastRenderedPageBreak/>
               <w:t>Px</w:t>
             </w:r>
             <w:r>
@@ -5341,6 +6643,7 @@
                 <w:sz w:val="40"/>
                 <w:szCs w:val="40"/>
               </w:rPr>
+              <w:lastRenderedPageBreak/>
               <w:t>Aky—ræ¥diyÒ |</w:t>
             </w:r>
           </w:p>
@@ -5379,6 +6682,7 @@
                 <w:sz w:val="28"/>
                 <w:szCs w:val="32"/>
               </w:rPr>
+              <w:lastRenderedPageBreak/>
               <w:t>T.S.4.4.3.2 – Kramam</w:t>
             </w:r>
           </w:p>
@@ -6126,7 +7430,6 @@
                 <w:sz w:val="28"/>
                 <w:szCs w:val="32"/>
               </w:rPr>
-              <w:lastRenderedPageBreak/>
               <w:t>T.S.4.4.4.2 – Kramam</w:t>
             </w:r>
           </w:p>
@@ -7391,6 +8694,7 @@
                 <w:sz w:val="28"/>
                 <w:szCs w:val="32"/>
               </w:rPr>
+              <w:lastRenderedPageBreak/>
               <w:t>Panchaati No</w:t>
             </w:r>
             <w:r>
@@ -7437,6 +8741,7 @@
                 <w:sz w:val="40"/>
                 <w:szCs w:val="40"/>
               </w:rPr>
+              <w:lastRenderedPageBreak/>
               <w:t>¥sëx</w:t>
             </w:r>
             <w:r>
@@ -7509,7 +8814,17 @@
                 <w:sz w:val="40"/>
                 <w:szCs w:val="40"/>
               </w:rPr>
-              <w:t xml:space="preserve"> CZy— </w:t>
+              <w:t xml:space="preserve"> </w:t>
+            </w:r>
+            <w:r>
+              <w:rPr>
+                <w:rFonts w:ascii="BRH Malayalam Extra" w:hAnsi="BRH Malayalam Extra" w:cs="BRH Malayalam Extra"/>
+                <w:color w:val="000000"/>
+                <w:sz w:val="40"/>
+                <w:szCs w:val="40"/>
+              </w:rPr>
+              <w:lastRenderedPageBreak/>
+              <w:t xml:space="preserve">CZy— </w:t>
             </w:r>
             <w:r>
               <w:rPr>
@@ -7575,6 +8890,7 @@
                 <w:sz w:val="40"/>
                 <w:szCs w:val="40"/>
               </w:rPr>
+              <w:lastRenderedPageBreak/>
               <w:t>¥sëx</w:t>
             </w:r>
             <w:r>
@@ -7647,7 +8963,17 @@
                 <w:sz w:val="40"/>
                 <w:szCs w:val="40"/>
               </w:rPr>
-              <w:t xml:space="preserve"> CZy— </w:t>
+              <w:t xml:space="preserve"> </w:t>
+            </w:r>
+            <w:r>
+              <w:rPr>
+                <w:rFonts w:ascii="BRH Malayalam Extra" w:hAnsi="BRH Malayalam Extra" w:cs="BRH Malayalam Extra"/>
+                <w:color w:val="000000"/>
+                <w:sz w:val="40"/>
+                <w:szCs w:val="40"/>
+              </w:rPr>
+              <w:lastRenderedPageBreak/>
+              <w:t xml:space="preserve">CZy— </w:t>
             </w:r>
             <w:r>
               <w:rPr>
@@ -7731,6 +9057,7 @@
                 <w:sz w:val="28"/>
                 <w:szCs w:val="32"/>
               </w:rPr>
+              <w:lastRenderedPageBreak/>
               <w:t>T.S.4.4.4.7 – Kramam</w:t>
             </w:r>
           </w:p>
@@ -8520,7 +9847,6 @@
                 <w:sz w:val="28"/>
                 <w:szCs w:val="32"/>
               </w:rPr>
-              <w:lastRenderedPageBreak/>
               <w:t>T.S.4.4.6.2 – Kramam</w:t>
             </w:r>
           </w:p>
@@ -9618,6 +10944,7 @@
                 <w:sz w:val="28"/>
                 <w:szCs w:val="32"/>
               </w:rPr>
+              <w:lastRenderedPageBreak/>
               <w:t>T.S.4.4.10.1 – Kramam</w:t>
             </w:r>
           </w:p>
@@ -10567,7 +11894,6 @@
                 <w:sz w:val="28"/>
                 <w:szCs w:val="32"/>
               </w:rPr>
-              <w:lastRenderedPageBreak/>
               <w:t>T.S.4.4.11.4 – Kramam</w:t>
             </w:r>
           </w:p>
@@ -11412,16 +12738,7 @@
           <w:bCs/>
           <w:sz w:val="32"/>
         </w:rPr>
-        <w:t xml:space="preserve">replaced </w:t>
-      </w:r>
-      <w:proofErr w:type="gramStart"/>
-      <w:r>
-        <w:rPr>
-          <w:b/>
-          <w:bCs/>
-          <w:sz w:val="32"/>
-        </w:rPr>
-        <w:t>with</w:t>
+        <w:t>replaced with</w:t>
       </w:r>
       <w:r>
         <w:rPr>
@@ -11443,7 +12760,6 @@
         </w:rPr>
         <w:t>"</w:t>
       </w:r>
-      <w:proofErr w:type="gramEnd"/>
       <w:r>
         <w:rPr>
           <w:rFonts w:ascii="BRH Malayalam" w:hAnsi="BRH Malayalam" w:cs="BRH Malayalam"/>
@@ -11455,7 +12771,6 @@
         </w:rPr>
         <w:t>q§T</w:t>
       </w:r>
-      <w:proofErr w:type="gramStart"/>
       <w:r>
         <w:rPr>
           <w:rFonts w:ascii="BRH Malayalam" w:hAnsi="BRH Malayalam" w:cs="BRH Malayalam"/>
@@ -11472,16 +12787,7 @@
           <w:bCs/>
           <w:sz w:val="32"/>
         </w:rPr>
-        <w:t>wherever</w:t>
-      </w:r>
-      <w:proofErr w:type="gramEnd"/>
-      <w:r>
-        <w:rPr>
-          <w:b/>
-          <w:bCs/>
-          <w:sz w:val="32"/>
-        </w:rPr>
-        <w:t xml:space="preserve"> applicable</w:t>
+        <w:t>wherever applicable</w:t>
       </w:r>
     </w:p>
     <w:p>
@@ -11534,6 +12840,7 @@
           <w:szCs w:val="32"/>
           <w:u w:val="single"/>
         </w:rPr>
+        <w:lastRenderedPageBreak/>
         <w:t xml:space="preserve">TS </w:t>
       </w:r>
       <w:r>
@@ -11888,7 +13195,7 @@
 </file>
 
 <file path=word/endnotes.xml><?xml version="1.0" encoding="utf-8"?>
-<w:endnotes xmlns:wpc="http://schemas.microsoft.com/office/word/2010/wordprocessingCanvas" xmlns:cx="http://schemas.microsoft.com/office/drawing/2014/chartex" xmlns:cx1="http://schemas.microsoft.com/office/drawing/2015/9/8/chartex" xmlns:cx2="http://schemas.microsoft.com/office/drawing/2015/10/21/chartex" xmlns:cx3="http://schemas.microsoft.com/office/drawing/2016/5/9/chartex" xmlns:cx4="http://schemas.microsoft.com/office/drawing/2016/5/10/chartex" xmlns:cx5="http://schemas.microsoft.com/office/drawing/2016/5/11/chartex" xmlns:cx6="http://schemas.microsoft.com/office/drawing/2016/5/12/chartex" xmlns:cx7="http://schemas.microsoft.com/office/drawing/2016/5/13/chartex" xmlns:cx8="http://schemas.microsoft.com/office/drawing/2016/5/14/chartex" xmlns:mc="http://schemas.openxmlformats.org/markup-compatibility/2006" xmlns:aink="http://schemas.microsoft.com/office/drawing/2016/ink" xmlns:am3d="http://schemas.microsoft.com/office/drawing/2017/model3d" xmlns:o="urn:schemas-microsoft-com:office:office" xmlns:oel="http://schemas.microsoft.com/office/2019/extlst" xmlns:r="http://schemas.openxmlformats.org/officeDocument/2006/relationships" xmlns:m="http://schemas.openxmlformats.org/officeDocument/2006/math" xmlns:v="urn:schemas-microsoft-com:vml" xmlns:wp14="http://schemas.microsoft.com/office/word/2010/wordprocessingDrawing" xmlns:wp="http://schemas.openxmlformats.org/drawingml/2006/wordprocessingDrawing" xmlns:w10="urn:schemas-microsoft-com:office:word" xmlns:w="http://schemas.openxmlformats.org/wordprocessingml/2006/main" xmlns:w14="http://schemas.microsoft.com/office/word/2010/wordml" xmlns:w15="http://schemas.microsoft.com/office/word/2012/wordml" xmlns:w16cei="http://schemas.microsoft.com/office/word/2026/wordml/cei" xmlns:w16cex="http://schemas.microsoft.com/office/word/2018/wordml/cex" xmlns:w16cid="http://schemas.microsoft.com/office/word/2016/wordml/cid" xmlns:w16="http://schemas.microsoft.com/office/word/2018/wordml" xmlns:w16du="http://schemas.microsoft.com/office/word/2023/wordml/word16du" xmlns:w16sdtdh="http://schemas.microsoft.com/office/word/2020/wordml/sdtdatahash" xmlns:w16sdtfl="http://schemas.microsoft.com/office/word/2024/wordml/sdtformatlock" xmlns:w16se="http://schemas.microsoft.com/office/word/2015/wordml/symex" xmlns:wpg="http://schemas.microsoft.com/office/word/2010/wordprocessingGroup" xmlns:wpi="http://schemas.microsoft.com/office/word/2010/wordprocessingInk" xmlns:wne="http://schemas.microsoft.com/office/word/2006/wordml" xmlns:wps="http://schemas.microsoft.com/office/word/2010/wordprocessingShape" mc:Ignorable="w14 w15 w16se w16cid w16 w16cex w16sdtdh w16sdtfl w16du wp14">
+<w:endnotes xmlns:wpc="http://schemas.microsoft.com/office/word/2010/wordprocessingCanvas" xmlns:cx="http://schemas.microsoft.com/office/drawing/2014/chartex" xmlns:cx1="http://schemas.microsoft.com/office/drawing/2015/9/8/chartex" xmlns:cx2="http://schemas.microsoft.com/office/drawing/2015/10/21/chartex" xmlns:cx3="http://schemas.microsoft.com/office/drawing/2016/5/9/chartex" xmlns:cx4="http://schemas.microsoft.com/office/drawing/2016/5/10/chartex" xmlns:cx5="http://schemas.microsoft.com/office/drawing/2016/5/11/chartex" xmlns:cx6="http://schemas.microsoft.com/office/drawing/2016/5/12/chartex" xmlns:cx7="http://schemas.microsoft.com/office/drawing/2016/5/13/chartex" xmlns:cx8="http://schemas.microsoft.com/office/drawing/2016/5/14/chartex" xmlns:mc="http://schemas.openxmlformats.org/markup-compatibility/2006" xmlns:aink="http://schemas.microsoft.com/office/drawing/2016/ink" xmlns:am3d="http://schemas.microsoft.com/office/drawing/2017/model3d" xmlns:o="urn:schemas-microsoft-com:office:office" xmlns:oel="http://schemas.microsoft.com/office/2019/extlst" xmlns:r="http://schemas.openxmlformats.org/officeDocument/2006/relationships" xmlns:m="http://schemas.openxmlformats.org/officeDocument/2006/math" xmlns:v="urn:schemas-microsoft-com:vml" xmlns:wp14="http://schemas.microsoft.com/office/word/2010/wordprocessingDrawing" xmlns:wp="http://schemas.openxmlformats.org/drawingml/2006/wordprocessingDrawing" xmlns:w10="urn:schemas-microsoft-com:office:word" xmlns:w="http://schemas.openxmlformats.org/wordprocessingml/2006/main" xmlns:w14="http://schemas.microsoft.com/office/word/2010/wordml" xmlns:w15="http://schemas.microsoft.com/office/word/2012/wordml" xmlns:w16cex="http://schemas.microsoft.com/office/word/2018/wordml/cex" xmlns:w16cid="http://schemas.microsoft.com/office/word/2016/wordml/cid" xmlns:w16="http://schemas.microsoft.com/office/word/2018/wordml" xmlns:w16du="http://schemas.microsoft.com/office/word/2023/wordml/word16du" xmlns:w16sdtdh="http://schemas.microsoft.com/office/word/2020/wordml/sdtdatahash" xmlns:w16sdtfl="http://schemas.microsoft.com/office/word/2024/wordml/sdtformatlock" xmlns:w16se="http://schemas.microsoft.com/office/word/2015/wordml/symex" xmlns:wpg="http://schemas.microsoft.com/office/word/2010/wordprocessingGroup" xmlns:wpi="http://schemas.microsoft.com/office/word/2010/wordprocessingInk" xmlns:wne="http://schemas.microsoft.com/office/word/2006/wordml" xmlns:wps="http://schemas.microsoft.com/office/word/2010/wordprocessingShape" mc:Ignorable="w14 w15 w16se w16cid w16 w16cex w16sdtdh w16sdtfl w16du wp14">
   <w:endnote w:type="separator" w:id="-1">
     <w:p>
       <w:pPr>
@@ -11913,7 +13220,7 @@
 </file>
 
 <file path=word/footer1.xml><?xml version="1.0" encoding="utf-8"?>
-<w:ftr xmlns:wpc="http://schemas.microsoft.com/office/word/2010/wordprocessingCanvas" xmlns:cx="http://schemas.microsoft.com/office/drawing/2014/chartex" xmlns:cx1="http://schemas.microsoft.com/office/drawing/2015/9/8/chartex" xmlns:cx2="http://schemas.microsoft.com/office/drawing/2015/10/21/chartex" xmlns:cx3="http://schemas.microsoft.com/office/drawing/2016/5/9/chartex" xmlns:cx4="http://schemas.microsoft.com/office/drawing/2016/5/10/chartex" xmlns:cx5="http://schemas.microsoft.com/office/drawing/2016/5/11/chartex" xmlns:cx6="http://schemas.microsoft.com/office/drawing/2016/5/12/chartex" xmlns:cx7="http://schemas.microsoft.com/office/drawing/2016/5/13/chartex" xmlns:cx8="http://schemas.microsoft.com/office/drawing/2016/5/14/chartex" xmlns:mc="http://schemas.openxmlformats.org/markup-compatibility/2006" xmlns:aink="http://schemas.microsoft.com/office/drawing/2016/ink" xmlns:am3d="http://schemas.microsoft.com/office/drawing/2017/model3d" xmlns:o="urn:schemas-microsoft-com:office:office" xmlns:oel="http://schemas.microsoft.com/office/2019/extlst" xmlns:r="http://schemas.openxmlformats.org/officeDocument/2006/relationships" xmlns:m="http://schemas.openxmlformats.org/officeDocument/2006/math" xmlns:v="urn:schemas-microsoft-com:vml" xmlns:wp14="http://schemas.microsoft.com/office/word/2010/wordprocessingDrawing" xmlns:wp="http://schemas.openxmlformats.org/drawingml/2006/wordprocessingDrawing" xmlns:w10="urn:schemas-microsoft-com:office:word" xmlns:w="http://schemas.openxmlformats.org/wordprocessingml/2006/main" xmlns:w14="http://schemas.microsoft.com/office/word/2010/wordml" xmlns:w15="http://schemas.microsoft.com/office/word/2012/wordml" xmlns:w16cei="http://schemas.microsoft.com/office/word/2026/wordml/cei" xmlns:w16cex="http://schemas.microsoft.com/office/word/2018/wordml/cex" xmlns:w16cid="http://schemas.microsoft.com/office/word/2016/wordml/cid" xmlns:w16="http://schemas.microsoft.com/office/word/2018/wordml" xmlns:w16du="http://schemas.microsoft.com/office/word/2023/wordml/word16du" xmlns:w16sdtdh="http://schemas.microsoft.com/office/word/2020/wordml/sdtdatahash" xmlns:w16sdtfl="http://schemas.microsoft.com/office/word/2024/wordml/sdtformatlock" xmlns:w16se="http://schemas.microsoft.com/office/word/2015/wordml/symex" xmlns:wpg="http://schemas.microsoft.com/office/word/2010/wordprocessingGroup" xmlns:wpi="http://schemas.microsoft.com/office/word/2010/wordprocessingInk" xmlns:wne="http://schemas.microsoft.com/office/word/2006/wordml" xmlns:wps="http://schemas.microsoft.com/office/word/2010/wordprocessingShape" mc:Ignorable="w14 w15 w16se w16cid w16 w16cex w16sdtdh w16sdtfl w16du wp14">
+<w:ftr xmlns:wpc="http://schemas.microsoft.com/office/word/2010/wordprocessingCanvas" xmlns:cx="http://schemas.microsoft.com/office/drawing/2014/chartex" xmlns:cx1="http://schemas.microsoft.com/office/drawing/2015/9/8/chartex" xmlns:cx2="http://schemas.microsoft.com/office/drawing/2015/10/21/chartex" xmlns:cx3="http://schemas.microsoft.com/office/drawing/2016/5/9/chartex" xmlns:cx4="http://schemas.microsoft.com/office/drawing/2016/5/10/chartex" xmlns:cx5="http://schemas.microsoft.com/office/drawing/2016/5/11/chartex" xmlns:cx6="http://schemas.microsoft.com/office/drawing/2016/5/12/chartex" xmlns:cx7="http://schemas.microsoft.com/office/drawing/2016/5/13/chartex" xmlns:cx8="http://schemas.microsoft.com/office/drawing/2016/5/14/chartex" xmlns:mc="http://schemas.openxmlformats.org/markup-compatibility/2006" xmlns:aink="http://schemas.microsoft.com/office/drawing/2016/ink" xmlns:am3d="http://schemas.microsoft.com/office/drawing/2017/model3d" xmlns:o="urn:schemas-microsoft-com:office:office" xmlns:oel="http://schemas.microsoft.com/office/2019/extlst" xmlns:r="http://schemas.openxmlformats.org/officeDocument/2006/relationships" xmlns:m="http://schemas.openxmlformats.org/officeDocument/2006/math" xmlns:v="urn:schemas-microsoft-com:vml" xmlns:wp14="http://schemas.microsoft.com/office/word/2010/wordprocessingDrawing" xmlns:wp="http://schemas.openxmlformats.org/drawingml/2006/wordprocessingDrawing" xmlns:w10="urn:schemas-microsoft-com:office:word" xmlns:w="http://schemas.openxmlformats.org/wordprocessingml/2006/main" xmlns:w14="http://schemas.microsoft.com/office/word/2010/wordml" xmlns:w15="http://schemas.microsoft.com/office/word/2012/wordml" xmlns:w16cex="http://schemas.microsoft.com/office/word/2018/wordml/cex" xmlns:w16cid="http://schemas.microsoft.com/office/word/2016/wordml/cid" xmlns:w16="http://schemas.microsoft.com/office/word/2018/wordml" xmlns:w16du="http://schemas.microsoft.com/office/word/2023/wordml/word16du" xmlns:w16sdtdh="http://schemas.microsoft.com/office/word/2020/wordml/sdtdatahash" xmlns:w16sdtfl="http://schemas.microsoft.com/office/word/2024/wordml/sdtformatlock" xmlns:w16se="http://schemas.microsoft.com/office/word/2015/wordml/symex" xmlns:wpg="http://schemas.microsoft.com/office/word/2010/wordprocessingGroup" xmlns:wpi="http://schemas.microsoft.com/office/word/2010/wordprocessingInk" xmlns:wne="http://schemas.microsoft.com/office/word/2006/wordml" xmlns:wps="http://schemas.microsoft.com/office/word/2010/wordprocessingShape" mc:Ignorable="w14 w15 w16se w16cid w16 w16cex w16sdtdh w16sdtfl w16du wp14">
   <w:p>
     <w:pPr>
       <w:pBdr>
@@ -12095,7 +13402,7 @@
 </file>
 
 <file path=word/footer2.xml><?xml version="1.0" encoding="utf-8"?>
-<w:ftr xmlns:wpc="http://schemas.microsoft.com/office/word/2010/wordprocessingCanvas" xmlns:cx="http://schemas.microsoft.com/office/drawing/2014/chartex" xmlns:cx1="http://schemas.microsoft.com/office/drawing/2015/9/8/chartex" xmlns:cx2="http://schemas.microsoft.com/office/drawing/2015/10/21/chartex" xmlns:cx3="http://schemas.microsoft.com/office/drawing/2016/5/9/chartex" xmlns:cx4="http://schemas.microsoft.com/office/drawing/2016/5/10/chartex" xmlns:cx5="http://schemas.microsoft.com/office/drawing/2016/5/11/chartex" xmlns:cx6="http://schemas.microsoft.com/office/drawing/2016/5/12/chartex" xmlns:cx7="http://schemas.microsoft.com/office/drawing/2016/5/13/chartex" xmlns:cx8="http://schemas.microsoft.com/office/drawing/2016/5/14/chartex" xmlns:mc="http://schemas.openxmlformats.org/markup-compatibility/2006" xmlns:aink="http://schemas.microsoft.com/office/drawing/2016/ink" xmlns:am3d="http://schemas.microsoft.com/office/drawing/2017/model3d" xmlns:o="urn:schemas-microsoft-com:office:office" xmlns:oel="http://schemas.microsoft.com/office/2019/extlst" xmlns:r="http://schemas.openxmlformats.org/officeDocument/2006/relationships" xmlns:m="http://schemas.openxmlformats.org/officeDocument/2006/math" xmlns:v="urn:schemas-microsoft-com:vml" xmlns:wp14="http://schemas.microsoft.com/office/word/2010/wordprocessingDrawing" xmlns:wp="http://schemas.openxmlformats.org/drawingml/2006/wordprocessingDrawing" xmlns:w10="urn:schemas-microsoft-com:office:word" xmlns:w="http://schemas.openxmlformats.org/wordprocessingml/2006/main" xmlns:w14="http://schemas.microsoft.com/office/word/2010/wordml" xmlns:w15="http://schemas.microsoft.com/office/word/2012/wordml" xmlns:w16cei="http://schemas.microsoft.com/office/word/2026/wordml/cei" xmlns:w16cex="http://schemas.microsoft.com/office/word/2018/wordml/cex" xmlns:w16cid="http://schemas.microsoft.com/office/word/2016/wordml/cid" xmlns:w16="http://schemas.microsoft.com/office/word/2018/wordml" xmlns:w16du="http://schemas.microsoft.com/office/word/2023/wordml/word16du" xmlns:w16sdtdh="http://schemas.microsoft.com/office/word/2020/wordml/sdtdatahash" xmlns:w16sdtfl="http://schemas.microsoft.com/office/word/2024/wordml/sdtformatlock" xmlns:w16se="http://schemas.microsoft.com/office/word/2015/wordml/symex" xmlns:wpg="http://schemas.microsoft.com/office/word/2010/wordprocessingGroup" xmlns:wpi="http://schemas.microsoft.com/office/word/2010/wordprocessingInk" xmlns:wne="http://schemas.microsoft.com/office/word/2006/wordml" xmlns:wps="http://schemas.microsoft.com/office/word/2010/wordprocessingShape" mc:Ignorable="w14 w15 w16se w16cid w16 w16cex w16sdtdh w16sdtfl w16du wp14">
+<w:ftr xmlns:wpc="http://schemas.microsoft.com/office/word/2010/wordprocessingCanvas" xmlns:cx="http://schemas.microsoft.com/office/drawing/2014/chartex" xmlns:cx1="http://schemas.microsoft.com/office/drawing/2015/9/8/chartex" xmlns:cx2="http://schemas.microsoft.com/office/drawing/2015/10/21/chartex" xmlns:cx3="http://schemas.microsoft.com/office/drawing/2016/5/9/chartex" xmlns:cx4="http://schemas.microsoft.com/office/drawing/2016/5/10/chartex" xmlns:cx5="http://schemas.microsoft.com/office/drawing/2016/5/11/chartex" xmlns:cx6="http://schemas.microsoft.com/office/drawing/2016/5/12/chartex" xmlns:cx7="http://schemas.microsoft.com/office/drawing/2016/5/13/chartex" xmlns:cx8="http://schemas.microsoft.com/office/drawing/2016/5/14/chartex" xmlns:mc="http://schemas.openxmlformats.org/markup-compatibility/2006" xmlns:aink="http://schemas.microsoft.com/office/drawing/2016/ink" xmlns:am3d="http://schemas.microsoft.com/office/drawing/2017/model3d" xmlns:o="urn:schemas-microsoft-com:office:office" xmlns:oel="http://schemas.microsoft.com/office/2019/extlst" xmlns:r="http://schemas.openxmlformats.org/officeDocument/2006/relationships" xmlns:m="http://schemas.openxmlformats.org/officeDocument/2006/math" xmlns:v="urn:schemas-microsoft-com:vml" xmlns:wp14="http://schemas.microsoft.com/office/word/2010/wordprocessingDrawing" xmlns:wp="http://schemas.openxmlformats.org/drawingml/2006/wordprocessingDrawing" xmlns:w10="urn:schemas-microsoft-com:office:word" xmlns:w="http://schemas.openxmlformats.org/wordprocessingml/2006/main" xmlns:w14="http://schemas.microsoft.com/office/word/2010/wordml" xmlns:w15="http://schemas.microsoft.com/office/word/2012/wordml" xmlns:w16cex="http://schemas.microsoft.com/office/word/2018/wordml/cex" xmlns:w16cid="http://schemas.microsoft.com/office/word/2016/wordml/cid" xmlns:w16="http://schemas.microsoft.com/office/word/2018/wordml" xmlns:w16du="http://schemas.microsoft.com/office/word/2023/wordml/word16du" xmlns:w16sdtdh="http://schemas.microsoft.com/office/word/2020/wordml/sdtdatahash" xmlns:w16sdtfl="http://schemas.microsoft.com/office/word/2024/wordml/sdtformatlock" xmlns:w16se="http://schemas.microsoft.com/office/word/2015/wordml/symex" xmlns:wpg="http://schemas.microsoft.com/office/word/2010/wordprocessingGroup" xmlns:wpi="http://schemas.microsoft.com/office/word/2010/wordprocessingInk" xmlns:wne="http://schemas.microsoft.com/office/word/2006/wordml" xmlns:wps="http://schemas.microsoft.com/office/word/2010/wordprocessingShape" mc:Ignorable="w14 w15 w16se w16cid w16 w16cex w16sdtdh w16sdtfl w16du wp14">
   <w:p>
     <w:pPr>
       <w:pBdr>
@@ -12298,7 +13605,7 @@
 </file>
 
 <file path=word/footnotes.xml><?xml version="1.0" encoding="utf-8"?>
-<w:footnotes xmlns:wpc="http://schemas.microsoft.com/office/word/2010/wordprocessingCanvas" xmlns:cx="http://schemas.microsoft.com/office/drawing/2014/chartex" xmlns:cx1="http://schemas.microsoft.com/office/drawing/2015/9/8/chartex" xmlns:cx2="http://schemas.microsoft.com/office/drawing/2015/10/21/chartex" xmlns:cx3="http://schemas.microsoft.com/office/drawing/2016/5/9/chartex" xmlns:cx4="http://schemas.microsoft.com/office/drawing/2016/5/10/chartex" xmlns:cx5="http://schemas.microsoft.com/office/drawing/2016/5/11/chartex" xmlns:cx6="http://schemas.microsoft.com/office/drawing/2016/5/12/chartex" xmlns:cx7="http://schemas.microsoft.com/office/drawing/2016/5/13/chartex" xmlns:cx8="http://schemas.microsoft.com/office/drawing/2016/5/14/chartex" xmlns:mc="http://schemas.openxmlformats.org/markup-compatibility/2006" xmlns:aink="http://schemas.microsoft.com/office/drawing/2016/ink" xmlns:am3d="http://schemas.microsoft.com/office/drawing/2017/model3d" xmlns:o="urn:schemas-microsoft-com:office:office" xmlns:oel="http://schemas.microsoft.com/office/2019/extlst" xmlns:r="http://schemas.openxmlformats.org/officeDocument/2006/relationships" xmlns:m="http://schemas.openxmlformats.org/officeDocument/2006/math" xmlns:v="urn:schemas-microsoft-com:vml" xmlns:wp14="http://schemas.microsoft.com/office/word/2010/wordprocessingDrawing" xmlns:wp="http://schemas.openxmlformats.org/drawingml/2006/wordprocessingDrawing" xmlns:w10="urn:schemas-microsoft-com:office:word" xmlns:w="http://schemas.openxmlformats.org/wordprocessingml/2006/main" xmlns:w14="http://schemas.microsoft.com/office/word/2010/wordml" xmlns:w15="http://schemas.microsoft.com/office/word/2012/wordml" xmlns:w16cei="http://schemas.microsoft.com/office/word/2026/wordml/cei" xmlns:w16cex="http://schemas.microsoft.com/office/word/2018/wordml/cex" xmlns:w16cid="http://schemas.microsoft.com/office/word/2016/wordml/cid" xmlns:w16="http://schemas.microsoft.com/office/word/2018/wordml" xmlns:w16du="http://schemas.microsoft.com/office/word/2023/wordml/word16du" xmlns:w16sdtdh="http://schemas.microsoft.com/office/word/2020/wordml/sdtdatahash" xmlns:w16sdtfl="http://schemas.microsoft.com/office/word/2024/wordml/sdtformatlock" xmlns:w16se="http://schemas.microsoft.com/office/word/2015/wordml/symex" xmlns:wpg="http://schemas.microsoft.com/office/word/2010/wordprocessingGroup" xmlns:wpi="http://schemas.microsoft.com/office/word/2010/wordprocessingInk" xmlns:wne="http://schemas.microsoft.com/office/word/2006/wordml" xmlns:wps="http://schemas.microsoft.com/office/word/2010/wordprocessingShape" mc:Ignorable="w14 w15 w16se w16cid w16 w16cex w16sdtdh w16sdtfl w16du wp14">
+<w:footnotes xmlns:wpc="http://schemas.microsoft.com/office/word/2010/wordprocessingCanvas" xmlns:cx="http://schemas.microsoft.com/office/drawing/2014/chartex" xmlns:cx1="http://schemas.microsoft.com/office/drawing/2015/9/8/chartex" xmlns:cx2="http://schemas.microsoft.com/office/drawing/2015/10/21/chartex" xmlns:cx3="http://schemas.microsoft.com/office/drawing/2016/5/9/chartex" xmlns:cx4="http://schemas.microsoft.com/office/drawing/2016/5/10/chartex" xmlns:cx5="http://schemas.microsoft.com/office/drawing/2016/5/11/chartex" xmlns:cx6="http://schemas.microsoft.com/office/drawing/2016/5/12/chartex" xmlns:cx7="http://schemas.microsoft.com/office/drawing/2016/5/13/chartex" xmlns:cx8="http://schemas.microsoft.com/office/drawing/2016/5/14/chartex" xmlns:mc="http://schemas.openxmlformats.org/markup-compatibility/2006" xmlns:aink="http://schemas.microsoft.com/office/drawing/2016/ink" xmlns:am3d="http://schemas.microsoft.com/office/drawing/2017/model3d" xmlns:o="urn:schemas-microsoft-com:office:office" xmlns:oel="http://schemas.microsoft.com/office/2019/extlst" xmlns:r="http://schemas.openxmlformats.org/officeDocument/2006/relationships" xmlns:m="http://schemas.openxmlformats.org/officeDocument/2006/math" xmlns:v="urn:schemas-microsoft-com:vml" xmlns:wp14="http://schemas.microsoft.com/office/word/2010/wordprocessingDrawing" xmlns:wp="http://schemas.openxmlformats.org/drawingml/2006/wordprocessingDrawing" xmlns:w10="urn:schemas-microsoft-com:office:word" xmlns:w="http://schemas.openxmlformats.org/wordprocessingml/2006/main" xmlns:w14="http://schemas.microsoft.com/office/word/2010/wordml" xmlns:w15="http://schemas.microsoft.com/office/word/2012/wordml" xmlns:w16cex="http://schemas.microsoft.com/office/word/2018/wordml/cex" xmlns:w16cid="http://schemas.microsoft.com/office/word/2016/wordml/cid" xmlns:w16="http://schemas.microsoft.com/office/word/2018/wordml" xmlns:w16du="http://schemas.microsoft.com/office/word/2023/wordml/word16du" xmlns:w16sdtdh="http://schemas.microsoft.com/office/word/2020/wordml/sdtdatahash" xmlns:w16sdtfl="http://schemas.microsoft.com/office/word/2024/wordml/sdtformatlock" xmlns:w16se="http://schemas.microsoft.com/office/word/2015/wordml/symex" xmlns:wpg="http://schemas.microsoft.com/office/word/2010/wordprocessingGroup" xmlns:wpi="http://schemas.microsoft.com/office/word/2010/wordprocessingInk" xmlns:wne="http://schemas.microsoft.com/office/word/2006/wordml" xmlns:wps="http://schemas.microsoft.com/office/word/2010/wordprocessingShape" mc:Ignorable="w14 w15 w16se w16cid w16 w16cex w16sdtdh w16sdtfl w16du wp14">
   <w:footnote w:type="separator" w:id="-1">
     <w:p>
       <w:pPr>
@@ -12323,7 +13630,7 @@
 </file>
 
 <file path=word/header1.xml><?xml version="1.0" encoding="utf-8"?>
-<w:hdr xmlns:wpc="http://schemas.microsoft.com/office/word/2010/wordprocessingCanvas" xmlns:cx="http://schemas.microsoft.com/office/drawing/2014/chartex" xmlns:cx1="http://schemas.microsoft.com/office/drawing/2015/9/8/chartex" xmlns:cx2="http://schemas.microsoft.com/office/drawing/2015/10/21/chartex" xmlns:cx3="http://schemas.microsoft.com/office/drawing/2016/5/9/chartex" xmlns:cx4="http://schemas.microsoft.com/office/drawing/2016/5/10/chartex" xmlns:cx5="http://schemas.microsoft.com/office/drawing/2016/5/11/chartex" xmlns:cx6="http://schemas.microsoft.com/office/drawing/2016/5/12/chartex" xmlns:cx7="http://schemas.microsoft.com/office/drawing/2016/5/13/chartex" xmlns:cx8="http://schemas.microsoft.com/office/drawing/2016/5/14/chartex" xmlns:mc="http://schemas.openxmlformats.org/markup-compatibility/2006" xmlns:aink="http://schemas.microsoft.com/office/drawing/2016/ink" xmlns:am3d="http://schemas.microsoft.com/office/drawing/2017/model3d" xmlns:o="urn:schemas-microsoft-com:office:office" xmlns:oel="http://schemas.microsoft.com/office/2019/extlst" xmlns:r="http://schemas.openxmlformats.org/officeDocument/2006/relationships" xmlns:m="http://schemas.openxmlformats.org/officeDocument/2006/math" xmlns:v="urn:schemas-microsoft-com:vml" xmlns:wp14="http://schemas.microsoft.com/office/word/2010/wordprocessingDrawing" xmlns:wp="http://schemas.openxmlformats.org/drawingml/2006/wordprocessingDrawing" xmlns:w10="urn:schemas-microsoft-com:office:word" xmlns:w="http://schemas.openxmlformats.org/wordprocessingml/2006/main" xmlns:w14="http://schemas.microsoft.com/office/word/2010/wordml" xmlns:w15="http://schemas.microsoft.com/office/word/2012/wordml" xmlns:w16cei="http://schemas.microsoft.com/office/word/2026/wordml/cei" xmlns:w16cex="http://schemas.microsoft.com/office/word/2018/wordml/cex" xmlns:w16cid="http://schemas.microsoft.com/office/word/2016/wordml/cid" xmlns:w16="http://schemas.microsoft.com/office/word/2018/wordml" xmlns:w16du="http://schemas.microsoft.com/office/word/2023/wordml/word16du" xmlns:w16sdtdh="http://schemas.microsoft.com/office/word/2020/wordml/sdtdatahash" xmlns:w16sdtfl="http://schemas.microsoft.com/office/word/2024/wordml/sdtformatlock" xmlns:w16se="http://schemas.microsoft.com/office/word/2015/wordml/symex" xmlns:wpg="http://schemas.microsoft.com/office/word/2010/wordprocessingGroup" xmlns:wpi="http://schemas.microsoft.com/office/word/2010/wordprocessingInk" xmlns:wne="http://schemas.microsoft.com/office/word/2006/wordml" xmlns:wps="http://schemas.microsoft.com/office/word/2010/wordprocessingShape" mc:Ignorable="w14 w15 w16se w16cid w16 w16cex w16sdtdh w16sdtfl w16du wp14">
+<w:hdr xmlns:wpc="http://schemas.microsoft.com/office/word/2010/wordprocessingCanvas" xmlns:cx="http://schemas.microsoft.com/office/drawing/2014/chartex" xmlns:cx1="http://schemas.microsoft.com/office/drawing/2015/9/8/chartex" xmlns:cx2="http://schemas.microsoft.com/office/drawing/2015/10/21/chartex" xmlns:cx3="http://schemas.microsoft.com/office/drawing/2016/5/9/chartex" xmlns:cx4="http://schemas.microsoft.com/office/drawing/2016/5/10/chartex" xmlns:cx5="http://schemas.microsoft.com/office/drawing/2016/5/11/chartex" xmlns:cx6="http://schemas.microsoft.com/office/drawing/2016/5/12/chartex" xmlns:cx7="http://schemas.microsoft.com/office/drawing/2016/5/13/chartex" xmlns:cx8="http://schemas.microsoft.com/office/drawing/2016/5/14/chartex" xmlns:mc="http://schemas.openxmlformats.org/markup-compatibility/2006" xmlns:aink="http://schemas.microsoft.com/office/drawing/2016/ink" xmlns:am3d="http://schemas.microsoft.com/office/drawing/2017/model3d" xmlns:o="urn:schemas-microsoft-com:office:office" xmlns:oel="http://schemas.microsoft.com/office/2019/extlst" xmlns:r="http://schemas.openxmlformats.org/officeDocument/2006/relationships" xmlns:m="http://schemas.openxmlformats.org/officeDocument/2006/math" xmlns:v="urn:schemas-microsoft-com:vml" xmlns:wp14="http://schemas.microsoft.com/office/word/2010/wordprocessingDrawing" xmlns:wp="http://schemas.openxmlformats.org/drawingml/2006/wordprocessingDrawing" xmlns:w10="urn:schemas-microsoft-com:office:word" xmlns:w="http://schemas.openxmlformats.org/wordprocessingml/2006/main" xmlns:w14="http://schemas.microsoft.com/office/word/2010/wordml" xmlns:w15="http://schemas.microsoft.com/office/word/2012/wordml" xmlns:w16cex="http://schemas.microsoft.com/office/word/2018/wordml/cex" xmlns:w16cid="http://schemas.microsoft.com/office/word/2016/wordml/cid" xmlns:w16="http://schemas.microsoft.com/office/word/2018/wordml" xmlns:w16du="http://schemas.microsoft.com/office/word/2023/wordml/word16du" xmlns:w16sdtdh="http://schemas.microsoft.com/office/word/2020/wordml/sdtdatahash" xmlns:w16sdtfl="http://schemas.microsoft.com/office/word/2024/wordml/sdtformatlock" xmlns:w16se="http://schemas.microsoft.com/office/word/2015/wordml/symex" xmlns:wpg="http://schemas.microsoft.com/office/word/2010/wordprocessingGroup" xmlns:wpi="http://schemas.microsoft.com/office/word/2010/wordprocessingInk" xmlns:wne="http://schemas.microsoft.com/office/word/2006/wordml" xmlns:wps="http://schemas.microsoft.com/office/word/2010/wordprocessingShape" mc:Ignorable="w14 w15 w16se w16cid w16 w16cex w16sdtdh w16sdtfl w16du wp14">
   <w:p>
     <w:pPr>
       <w:pStyle w:val="Header"/>
@@ -12336,7 +13643,7 @@
 </file>
 
 <file path=word/header2.xml><?xml version="1.0" encoding="utf-8"?>
-<w:hdr xmlns:wpc="http://schemas.microsoft.com/office/word/2010/wordprocessingCanvas" xmlns:cx="http://schemas.microsoft.com/office/drawing/2014/chartex" xmlns:cx1="http://schemas.microsoft.com/office/drawing/2015/9/8/chartex" xmlns:cx2="http://schemas.microsoft.com/office/drawing/2015/10/21/chartex" xmlns:cx3="http://schemas.microsoft.com/office/drawing/2016/5/9/chartex" xmlns:cx4="http://schemas.microsoft.com/office/drawing/2016/5/10/chartex" xmlns:cx5="http://schemas.microsoft.com/office/drawing/2016/5/11/chartex" xmlns:cx6="http://schemas.microsoft.com/office/drawing/2016/5/12/chartex" xmlns:cx7="http://schemas.microsoft.com/office/drawing/2016/5/13/chartex" xmlns:cx8="http://schemas.microsoft.com/office/drawing/2016/5/14/chartex" xmlns:mc="http://schemas.openxmlformats.org/markup-compatibility/2006" xmlns:aink="http://schemas.microsoft.com/office/drawing/2016/ink" xmlns:am3d="http://schemas.microsoft.com/office/drawing/2017/model3d" xmlns:o="urn:schemas-microsoft-com:office:office" xmlns:oel="http://schemas.microsoft.com/office/2019/extlst" xmlns:r="http://schemas.openxmlformats.org/officeDocument/2006/relationships" xmlns:m="http://schemas.openxmlformats.org/officeDocument/2006/math" xmlns:v="urn:schemas-microsoft-com:vml" xmlns:wp14="http://schemas.microsoft.com/office/word/2010/wordprocessingDrawing" xmlns:wp="http://schemas.openxmlformats.org/drawingml/2006/wordprocessingDrawing" xmlns:w10="urn:schemas-microsoft-com:office:word" xmlns:w="http://schemas.openxmlformats.org/wordprocessingml/2006/main" xmlns:w14="http://schemas.microsoft.com/office/word/2010/wordml" xmlns:w15="http://schemas.microsoft.com/office/word/2012/wordml" xmlns:w16cei="http://schemas.microsoft.com/office/word/2026/wordml/cei" xmlns:w16cex="http://schemas.microsoft.com/office/word/2018/wordml/cex" xmlns:w16cid="http://schemas.microsoft.com/office/word/2016/wordml/cid" xmlns:w16="http://schemas.microsoft.com/office/word/2018/wordml" xmlns:w16du="http://schemas.microsoft.com/office/word/2023/wordml/word16du" xmlns:w16sdtdh="http://schemas.microsoft.com/office/word/2020/wordml/sdtdatahash" xmlns:w16sdtfl="http://schemas.microsoft.com/office/word/2024/wordml/sdtformatlock" xmlns:w16se="http://schemas.microsoft.com/office/word/2015/wordml/symex" xmlns:wpg="http://schemas.microsoft.com/office/word/2010/wordprocessingGroup" xmlns:wpi="http://schemas.microsoft.com/office/word/2010/wordprocessingInk" xmlns:wne="http://schemas.microsoft.com/office/word/2006/wordml" xmlns:wps="http://schemas.microsoft.com/office/word/2010/wordprocessingShape" mc:Ignorable="w14 w15 w16se w16cid w16 w16cex w16sdtdh w16sdtfl w16du wp14">
+<w:hdr xmlns:wpc="http://schemas.microsoft.com/office/word/2010/wordprocessingCanvas" xmlns:cx="http://schemas.microsoft.com/office/drawing/2014/chartex" xmlns:cx1="http://schemas.microsoft.com/office/drawing/2015/9/8/chartex" xmlns:cx2="http://schemas.microsoft.com/office/drawing/2015/10/21/chartex" xmlns:cx3="http://schemas.microsoft.com/office/drawing/2016/5/9/chartex" xmlns:cx4="http://schemas.microsoft.com/office/drawing/2016/5/10/chartex" xmlns:cx5="http://schemas.microsoft.com/office/drawing/2016/5/11/chartex" xmlns:cx6="http://schemas.microsoft.com/office/drawing/2016/5/12/chartex" xmlns:cx7="http://schemas.microsoft.com/office/drawing/2016/5/13/chartex" xmlns:cx8="http://schemas.microsoft.com/office/drawing/2016/5/14/chartex" xmlns:mc="http://schemas.openxmlformats.org/markup-compatibility/2006" xmlns:aink="http://schemas.microsoft.com/office/drawing/2016/ink" xmlns:am3d="http://schemas.microsoft.com/office/drawing/2017/model3d" xmlns:o="urn:schemas-microsoft-com:office:office" xmlns:oel="http://schemas.microsoft.com/office/2019/extlst" xmlns:r="http://schemas.openxmlformats.org/officeDocument/2006/relationships" xmlns:m="http://schemas.openxmlformats.org/officeDocument/2006/math" xmlns:v="urn:schemas-microsoft-com:vml" xmlns:wp14="http://schemas.microsoft.com/office/word/2010/wordprocessingDrawing" xmlns:wp="http://schemas.openxmlformats.org/drawingml/2006/wordprocessingDrawing" xmlns:w10="urn:schemas-microsoft-com:office:word" xmlns:w="http://schemas.openxmlformats.org/wordprocessingml/2006/main" xmlns:w14="http://schemas.microsoft.com/office/word/2010/wordml" xmlns:w15="http://schemas.microsoft.com/office/word/2012/wordml" xmlns:w16cex="http://schemas.microsoft.com/office/word/2018/wordml/cex" xmlns:w16cid="http://schemas.microsoft.com/office/word/2016/wordml/cid" xmlns:w16="http://schemas.microsoft.com/office/word/2018/wordml" xmlns:w16du="http://schemas.microsoft.com/office/word/2023/wordml/word16du" xmlns:w16sdtdh="http://schemas.microsoft.com/office/word/2020/wordml/sdtdatahash" xmlns:w16sdtfl="http://schemas.microsoft.com/office/word/2024/wordml/sdtformatlock" xmlns:w16se="http://schemas.microsoft.com/office/word/2015/wordml/symex" xmlns:wpg="http://schemas.microsoft.com/office/word/2010/wordprocessingGroup" xmlns:wpi="http://schemas.microsoft.com/office/word/2010/wordprocessingInk" xmlns:wne="http://schemas.microsoft.com/office/word/2006/wordml" xmlns:wps="http://schemas.microsoft.com/office/word/2010/wordprocessingShape" mc:Ignorable="w14 w15 w16se w16cid w16 w16cex w16sdtdh w16sdtfl w16du wp14">
   <w:p>
     <w:pPr>
       <w:pStyle w:val="Header"/>

</xml_diff>

<commit_message>
nmv 29 09 2026
</commit_message>
<xml_diff>
--- a/TS-Kramam/TS-4.4/TS 4.4 Malayalam Krama Paatam Corrections.docx
+++ b/TS-Kramam/TS-4.4/TS 4.4 Malayalam Krama Paatam Corrections.docx
@@ -2029,16 +2029,7 @@
                 <w:sz w:val="28"/>
                 <w:szCs w:val="32"/>
               </w:rPr>
-              <w:t>T.S.4.4.</w:t>
-            </w:r>
-            <w:r>
-              <w:rPr>
-                <w:rFonts w:cs="Arial"/>
-                <w:b/>
-                <w:sz w:val="28"/>
-                <w:szCs w:val="32"/>
-              </w:rPr>
-              <w:t>9.1</w:t>
+              <w:t>T.S.4.4.9.1</w:t>
             </w:r>
             <w:r>
               <w:rPr>
@@ -2556,6 +2547,553 @@
                 <w:lang w:val="it-IT"/>
               </w:rPr>
               <w:t>J |</w:t>
+            </w:r>
+          </w:p>
+        </w:tc>
+      </w:tr>
+      <w:tr>
+        <w:trPr>
+          <w:trHeight w:val="2259"/>
+        </w:trPr>
+        <w:tc>
+          <w:tcPr>
+            <w:tcW w:w="3906" w:type="dxa"/>
+          </w:tcPr>
+          <w:p>
+            <w:pPr>
+              <w:widowControl w:val="0"/>
+              <w:tabs>
+                <w:tab w:val="left" w:pos="993"/>
+              </w:tabs>
+              <w:autoSpaceDE w:val="0"/>
+              <w:autoSpaceDN w:val="0"/>
+              <w:adjustRightInd w:val="0"/>
+              <w:spacing w:before="0" w:line="240" w:lineRule="auto"/>
+              <w:ind w:right="297"/>
+              <w:rPr>
+                <w:rFonts w:cs="Arial"/>
+                <w:b/>
+                <w:sz w:val="28"/>
+                <w:szCs w:val="32"/>
+              </w:rPr>
+            </w:pPr>
+            <w:r>
+              <w:rPr>
+                <w:rFonts w:cs="Arial"/>
+                <w:b/>
+                <w:sz w:val="28"/>
+                <w:szCs w:val="32"/>
+              </w:rPr>
+              <w:lastRenderedPageBreak/>
+              <w:t>T.S.4.4.</w:t>
+            </w:r>
+            <w:r>
+              <w:rPr>
+                <w:rFonts w:cs="Arial"/>
+                <w:b/>
+                <w:sz w:val="28"/>
+                <w:szCs w:val="32"/>
+              </w:rPr>
+              <w:t>12.4</w:t>
+            </w:r>
+            <w:r>
+              <w:rPr>
+                <w:rFonts w:cs="Arial"/>
+                <w:b/>
+                <w:sz w:val="28"/>
+                <w:szCs w:val="32"/>
+              </w:rPr>
+              <w:t xml:space="preserve"> – Kramam</w:t>
+            </w:r>
+          </w:p>
+          <w:p>
+            <w:pPr>
+              <w:widowControl w:val="0"/>
+              <w:tabs>
+                <w:tab w:val="left" w:pos="993"/>
+              </w:tabs>
+              <w:autoSpaceDE w:val="0"/>
+              <w:autoSpaceDN w:val="0"/>
+              <w:adjustRightInd w:val="0"/>
+              <w:spacing w:before="0" w:line="240" w:lineRule="auto"/>
+              <w:ind w:right="297"/>
+              <w:rPr>
+                <w:rFonts w:cs="Arial"/>
+                <w:b/>
+                <w:sz w:val="28"/>
+                <w:szCs w:val="32"/>
+                <w:lang w:val="en-IN"/>
+              </w:rPr>
+            </w:pPr>
+            <w:r>
+              <w:rPr>
+                <w:rFonts w:cs="Arial"/>
+                <w:b/>
+                <w:sz w:val="28"/>
+                <w:szCs w:val="32"/>
+                <w:lang w:val="en-IN"/>
+              </w:rPr>
+              <w:t xml:space="preserve">Krama Vaakyam No.– </w:t>
+            </w:r>
+            <w:r>
+              <w:rPr>
+                <w:rFonts w:cs="Arial"/>
+                <w:b/>
+                <w:sz w:val="28"/>
+                <w:szCs w:val="32"/>
+                <w:lang w:val="en-IN"/>
+              </w:rPr>
+              <w:t>42,43,44</w:t>
+            </w:r>
+          </w:p>
+          <w:p>
+            <w:pPr>
+              <w:widowControl w:val="0"/>
+              <w:tabs>
+                <w:tab w:val="left" w:pos="993"/>
+              </w:tabs>
+              <w:autoSpaceDE w:val="0"/>
+              <w:autoSpaceDN w:val="0"/>
+              <w:adjustRightInd w:val="0"/>
+              <w:spacing w:before="0" w:line="240" w:lineRule="auto"/>
+              <w:ind w:right="297"/>
+              <w:rPr>
+                <w:rFonts w:cs="Arial"/>
+                <w:b/>
+                <w:sz w:val="28"/>
+                <w:szCs w:val="32"/>
+                <w:lang w:val="it-IT"/>
+              </w:rPr>
+            </w:pPr>
+            <w:r>
+              <w:rPr>
+                <w:rFonts w:cs="Arial"/>
+                <w:b/>
+                <w:sz w:val="28"/>
+                <w:szCs w:val="32"/>
+                <w:lang w:val="it-IT"/>
+              </w:rPr>
+              <w:t>Panchaati No</w:t>
+            </w:r>
+            <w:r>
+              <w:rPr>
+                <w:rFonts w:cs="Arial"/>
+                <w:b/>
+                <w:szCs w:val="32"/>
+                <w:lang w:val="it-IT"/>
+              </w:rPr>
+              <w:t xml:space="preserve">. - </w:t>
+            </w:r>
+            <w:r>
+              <w:rPr>
+                <w:rFonts w:cs="Arial"/>
+                <w:b/>
+                <w:szCs w:val="32"/>
+                <w:lang w:val="it-IT"/>
+              </w:rPr>
+              <w:t>36</w:t>
+            </w:r>
+          </w:p>
+        </w:tc>
+        <w:tc>
+          <w:tcPr>
+            <w:tcW w:w="5103" w:type="dxa"/>
+          </w:tcPr>
+          <w:p>
+            <w:pPr>
+              <w:widowControl w:val="0"/>
+              <w:autoSpaceDE w:val="0"/>
+              <w:autoSpaceDN w:val="0"/>
+              <w:adjustRightInd w:val="0"/>
+              <w:spacing w:before="0" w:line="240" w:lineRule="auto"/>
+              <w:rPr>
+                <w:rFonts w:ascii="BRH Malayalam Extra" w:hAnsi="BRH Malayalam Extra" w:cs="BRH Malayalam Extra"/>
+                <w:color w:val="000000"/>
+                <w:sz w:val="40"/>
+                <w:szCs w:val="40"/>
+                <w:lang w:val="it-IT"/>
+              </w:rPr>
+            </w:pPr>
+            <w:r>
+              <w:rPr>
+                <w:rFonts w:ascii="BRH Malayalam Extra" w:hAnsi="BRH Malayalam Extra" w:cs="BRH Malayalam Extra"/>
+                <w:color w:val="000000"/>
+                <w:sz w:val="40"/>
+                <w:szCs w:val="40"/>
+                <w:lang w:val="it-IT"/>
+              </w:rPr>
+              <w:t>sxixZy—</w:t>
+            </w:r>
+            <w:r>
+              <w:rPr>
+                <w:rFonts w:ascii="BRH Malayalam Extra" w:hAnsi="BRH Malayalam Extra" w:cs="BRH Malayalam Extra"/>
+                <w:color w:val="000000"/>
+                <w:sz w:val="40"/>
+                <w:szCs w:val="40"/>
+                <w:highlight w:val="yellow"/>
+                <w:lang w:val="it-IT"/>
+              </w:rPr>
+              <w:t>Q</w:t>
+            </w:r>
+            <w:r>
+              <w:rPr>
+                <w:rFonts w:ascii="BRH Malayalam Extra" w:hAnsi="BRH Malayalam Extra" w:cs="BRH Malayalam Extra"/>
+                <w:color w:val="000000"/>
+                <w:sz w:val="40"/>
+                <w:szCs w:val="40"/>
+                <w:lang w:val="it-IT"/>
+              </w:rPr>
+              <w:t xml:space="preserve">ÉxJ | </w:t>
+            </w:r>
+          </w:p>
+          <w:p>
+            <w:pPr>
+              <w:widowControl w:val="0"/>
+              <w:autoSpaceDE w:val="0"/>
+              <w:autoSpaceDN w:val="0"/>
+              <w:adjustRightInd w:val="0"/>
+              <w:spacing w:before="0" w:line="240" w:lineRule="auto"/>
+              <w:rPr>
+                <w:rFonts w:ascii="BRH Malayalam Extra" w:hAnsi="BRH Malayalam Extra" w:cs="BRH Malayalam Extra"/>
+                <w:color w:val="000000"/>
+                <w:sz w:val="40"/>
+                <w:szCs w:val="40"/>
+                <w:lang w:val="it-IT"/>
+              </w:rPr>
+            </w:pPr>
+            <w:r>
+              <w:rPr>
+                <w:rFonts w:ascii="BRH Malayalam Extra" w:hAnsi="BRH Malayalam Extra" w:cs="BRH Malayalam Extra"/>
+                <w:color w:val="000000"/>
+                <w:sz w:val="40"/>
+                <w:szCs w:val="40"/>
+                <w:lang w:val="it-IT"/>
+              </w:rPr>
+              <w:t>AZy—</w:t>
+            </w:r>
+            <w:r>
+              <w:rPr>
+                <w:rFonts w:ascii="BRH Malayalam Extra" w:hAnsi="BRH Malayalam Extra" w:cs="BRH Malayalam Extra"/>
+                <w:color w:val="000000"/>
+                <w:sz w:val="40"/>
+                <w:szCs w:val="40"/>
+                <w:highlight w:val="yellow"/>
+                <w:lang w:val="it-IT"/>
+              </w:rPr>
+              <w:t>Q</w:t>
+            </w:r>
+            <w:r>
+              <w:rPr>
+                <w:rFonts w:ascii="BRH Malayalam Extra" w:hAnsi="BRH Malayalam Extra" w:cs="BRH Malayalam Extra"/>
+                <w:color w:val="000000"/>
+                <w:sz w:val="40"/>
+                <w:szCs w:val="40"/>
+                <w:lang w:val="it-IT"/>
+              </w:rPr>
+              <w:t>Éx D | AZy—</w:t>
+            </w:r>
+            <w:r>
+              <w:rPr>
+                <w:rFonts w:ascii="BRH Malayalam Extra" w:hAnsi="BRH Malayalam Extra" w:cs="BRH Malayalam Extra"/>
+                <w:color w:val="000000"/>
+                <w:sz w:val="40"/>
+                <w:szCs w:val="40"/>
+                <w:highlight w:val="yellow"/>
+                <w:lang w:val="it-IT"/>
+              </w:rPr>
+              <w:t>Q</w:t>
+            </w:r>
+            <w:r>
+              <w:rPr>
+                <w:rFonts w:ascii="BRH Malayalam Extra" w:hAnsi="BRH Malayalam Extra" w:cs="BRH Malayalam Extra"/>
+                <w:color w:val="000000"/>
+                <w:sz w:val="40"/>
+                <w:szCs w:val="40"/>
+                <w:lang w:val="it-IT"/>
+              </w:rPr>
+              <w:t>Éx</w:t>
+            </w:r>
+            <w:r>
+              <w:rPr>
+                <w:rFonts w:ascii="BRH Malayalam Extra" w:hAnsi="BRH Malayalam Extra" w:cs="BRH Malayalam Extra"/>
+                <w:color w:val="000000"/>
+                <w:sz w:val="32"/>
+                <w:szCs w:val="40"/>
+                <w:lang w:val="it-IT"/>
+              </w:rPr>
+              <w:t>–</w:t>
+            </w:r>
+            <w:r>
+              <w:rPr>
+                <w:rFonts w:ascii="BRH Malayalam Extra" w:hAnsi="BRH Malayalam Extra" w:cs="BRH Malayalam Extra"/>
+                <w:color w:val="000000"/>
+                <w:sz w:val="40"/>
+                <w:szCs w:val="40"/>
+                <w:lang w:val="it-IT"/>
+              </w:rPr>
+              <w:t xml:space="preserve"> CZõZy—-Q</w:t>
+            </w:r>
+            <w:r>
+              <w:rPr>
+                <w:rFonts w:ascii="BRH Malayalam Extra" w:hAnsi="BRH Malayalam Extra" w:cs="BRH Malayalam Extra"/>
+                <w:color w:val="000000"/>
+                <w:sz w:val="32"/>
+                <w:szCs w:val="40"/>
+                <w:lang w:val="it-IT"/>
+              </w:rPr>
+              <w:t>–</w:t>
+            </w:r>
+            <w:r>
+              <w:rPr>
+                <w:rFonts w:ascii="BRH Malayalam Extra" w:hAnsi="BRH Malayalam Extra" w:cs="BRH Malayalam Extra"/>
+                <w:color w:val="000000"/>
+                <w:sz w:val="40"/>
+                <w:szCs w:val="40"/>
+                <w:lang w:val="it-IT"/>
+              </w:rPr>
+              <w:t>Éx</w:t>
+            </w:r>
+            <w:r>
+              <w:rPr>
+                <w:rFonts w:ascii="BRH Malayalam Extra" w:hAnsi="BRH Malayalam Extra" w:cs="BRH Malayalam Extra"/>
+                <w:color w:val="000000"/>
+                <w:sz w:val="32"/>
+                <w:szCs w:val="40"/>
+                <w:lang w:val="it-IT"/>
+              </w:rPr>
+              <w:t>–</w:t>
+            </w:r>
+            <w:r>
+              <w:rPr>
+                <w:rFonts w:ascii="BRH Malayalam Extra" w:hAnsi="BRH Malayalam Extra" w:cs="BRH Malayalam Extra"/>
+                <w:color w:val="000000"/>
+                <w:sz w:val="40"/>
+                <w:szCs w:val="40"/>
+                <w:lang w:val="it-IT"/>
+              </w:rPr>
+              <w:t>J |</w:t>
+            </w:r>
+          </w:p>
+        </w:tc>
+        <w:tc>
+          <w:tcPr>
+            <w:tcW w:w="5386" w:type="dxa"/>
+          </w:tcPr>
+          <w:p>
+            <w:pPr>
+              <w:widowControl w:val="0"/>
+              <w:autoSpaceDE w:val="0"/>
+              <w:autoSpaceDN w:val="0"/>
+              <w:adjustRightInd w:val="0"/>
+              <w:spacing w:before="0" w:line="240" w:lineRule="auto"/>
+              <w:ind w:right="-90"/>
+              <w:rPr>
+                <w:rFonts w:ascii="BRH Malayalam Extra" w:hAnsi="BRH Malayalam Extra" w:cs="BRH Malayalam Extra"/>
+                <w:color w:val="000000"/>
+                <w:sz w:val="40"/>
+                <w:szCs w:val="40"/>
+                <w:lang w:val="it-IT"/>
+              </w:rPr>
+            </w:pPr>
+            <w:r>
+              <w:rPr>
+                <w:rFonts w:ascii="BRH Malayalam Extra" w:hAnsi="BRH Malayalam Extra" w:cs="BRH Malayalam Extra"/>
+                <w:color w:val="000000"/>
+                <w:sz w:val="40"/>
+                <w:szCs w:val="40"/>
+                <w:lang w:val="it-IT"/>
+              </w:rPr>
+              <w:t>sxixZy</w:t>
+            </w:r>
+            <w:r>
+              <w:rPr>
+                <w:rFonts w:ascii="BRH Malayalam Extra" w:hAnsi="BRH Malayalam Extra" w:cs="BRH Malayalam Extra"/>
+                <w:color w:val="000000"/>
+                <w:sz w:val="40"/>
+                <w:szCs w:val="40"/>
+                <w:lang w:val="it-IT"/>
+              </w:rPr>
+              <w:t>—</w:t>
+            </w:r>
+            <w:r>
+              <w:rPr>
+                <w:rFonts w:ascii="BRH Malayalam Extra" w:hAnsi="BRH Malayalam Extra" w:cs="BRH Malayalam Extra"/>
+                <w:color w:val="000000"/>
+                <w:sz w:val="40"/>
+                <w:szCs w:val="40"/>
+                <w:highlight w:val="green"/>
+                <w:lang w:val="it-IT"/>
+              </w:rPr>
+              <w:t>P</w:t>
+            </w:r>
+            <w:r>
+              <w:rPr>
+                <w:rFonts w:ascii="BRH Malayalam Extra" w:hAnsi="BRH Malayalam Extra" w:cs="BRH Malayalam Extra"/>
+                <w:color w:val="000000"/>
+                <w:sz w:val="32"/>
+                <w:szCs w:val="32"/>
+                <w:lang w:val="it-IT"/>
+              </w:rPr>
+              <w:t>â</w:t>
+            </w:r>
+            <w:r>
+              <w:rPr>
+                <w:rFonts w:ascii="BRH Malayalam Extra" w:hAnsi="BRH Malayalam Extra" w:cs="BRH Malayalam Extra"/>
+                <w:color w:val="000000"/>
+                <w:sz w:val="40"/>
+                <w:szCs w:val="40"/>
+                <w:lang w:val="it-IT"/>
+              </w:rPr>
+              <w:t xml:space="preserve">ÉxJ | </w:t>
+            </w:r>
+          </w:p>
+          <w:p>
+            <w:pPr>
+              <w:widowControl w:val="0"/>
+              <w:autoSpaceDE w:val="0"/>
+              <w:autoSpaceDN w:val="0"/>
+              <w:adjustRightInd w:val="0"/>
+              <w:spacing w:before="0" w:line="240" w:lineRule="auto"/>
+              <w:ind w:right="-90"/>
+              <w:rPr>
+                <w:rFonts w:ascii="BRH Malayalam Extra" w:hAnsi="BRH Malayalam Extra" w:cs="BRH Malayalam Extra"/>
+                <w:color w:val="000000"/>
+                <w:sz w:val="40"/>
+                <w:szCs w:val="40"/>
+                <w:lang w:val="it-IT"/>
+              </w:rPr>
+            </w:pPr>
+            <w:r>
+              <w:rPr>
+                <w:rFonts w:ascii="BRH Malayalam Extra" w:hAnsi="BRH Malayalam Extra" w:cs="BRH Malayalam Extra"/>
+                <w:color w:val="000000"/>
+                <w:sz w:val="40"/>
+                <w:szCs w:val="40"/>
+                <w:lang w:val="it-IT"/>
+              </w:rPr>
+              <w:t>AZy—</w:t>
+            </w:r>
+            <w:r>
+              <w:rPr>
+                <w:rFonts w:ascii="BRH Malayalam Extra" w:hAnsi="BRH Malayalam Extra" w:cs="BRH Malayalam Extra"/>
+                <w:color w:val="000000"/>
+                <w:sz w:val="40"/>
+                <w:szCs w:val="40"/>
+                <w:highlight w:val="green"/>
+                <w:lang w:val="it-IT"/>
+              </w:rPr>
+              <w:t>P</w:t>
+            </w:r>
+            <w:r>
+              <w:rPr>
+                <w:rFonts w:ascii="BRH Malayalam Extra" w:hAnsi="BRH Malayalam Extra" w:cs="BRH Malayalam Extra"/>
+                <w:color w:val="000000"/>
+                <w:sz w:val="32"/>
+                <w:szCs w:val="32"/>
+                <w:lang w:val="it-IT"/>
+              </w:rPr>
+              <w:t>â</w:t>
+            </w:r>
+            <w:r>
+              <w:rPr>
+                <w:rFonts w:ascii="BRH Malayalam Extra" w:hAnsi="BRH Malayalam Extra" w:cs="BRH Malayalam Extra"/>
+                <w:color w:val="000000"/>
+                <w:sz w:val="40"/>
+                <w:szCs w:val="40"/>
+                <w:lang w:val="it-IT"/>
+              </w:rPr>
+              <w:t>Éx D | AZy—</w:t>
+            </w:r>
+            <w:r>
+              <w:rPr>
+                <w:rFonts w:ascii="BRH Malayalam Extra" w:hAnsi="BRH Malayalam Extra" w:cs="BRH Malayalam Extra"/>
+                <w:color w:val="000000"/>
+                <w:sz w:val="40"/>
+                <w:szCs w:val="40"/>
+                <w:highlight w:val="green"/>
+                <w:lang w:val="it-IT"/>
+              </w:rPr>
+              <w:t>P</w:t>
+            </w:r>
+            <w:r>
+              <w:rPr>
+                <w:rFonts w:ascii="BRH Malayalam Extra" w:hAnsi="BRH Malayalam Extra" w:cs="BRH Malayalam Extra"/>
+                <w:color w:val="000000"/>
+                <w:sz w:val="32"/>
+                <w:szCs w:val="32"/>
+                <w:lang w:val="it-IT"/>
+              </w:rPr>
+              <w:t>â</w:t>
+            </w:r>
+            <w:r>
+              <w:rPr>
+                <w:rFonts w:ascii="BRH Malayalam Extra" w:hAnsi="BRH Malayalam Extra" w:cs="BRH Malayalam Extra"/>
+                <w:color w:val="000000"/>
+                <w:sz w:val="40"/>
+                <w:szCs w:val="40"/>
+                <w:lang w:val="it-IT"/>
+              </w:rPr>
+              <w:t>Éx</w:t>
+            </w:r>
+            <w:r>
+              <w:rPr>
+                <w:rFonts w:ascii="BRH Malayalam Extra" w:hAnsi="BRH Malayalam Extra" w:cs="BRH Malayalam Extra"/>
+                <w:color w:val="000000"/>
+                <w:sz w:val="32"/>
+                <w:szCs w:val="40"/>
+                <w:lang w:val="it-IT"/>
+              </w:rPr>
+              <w:t>–</w:t>
+            </w:r>
+            <w:r>
+              <w:rPr>
+                <w:rFonts w:ascii="BRH Malayalam Extra" w:hAnsi="BRH Malayalam Extra" w:cs="BRH Malayalam Extra"/>
+                <w:color w:val="000000"/>
+                <w:sz w:val="40"/>
+                <w:szCs w:val="40"/>
+                <w:lang w:val="it-IT"/>
+              </w:rPr>
+              <w:t xml:space="preserve"> CZõZy—-Q</w:t>
+            </w:r>
+            <w:r>
+              <w:rPr>
+                <w:rFonts w:ascii="BRH Malayalam Extra" w:hAnsi="BRH Malayalam Extra" w:cs="BRH Malayalam Extra"/>
+                <w:color w:val="000000"/>
+                <w:sz w:val="32"/>
+                <w:szCs w:val="40"/>
+                <w:lang w:val="it-IT"/>
+              </w:rPr>
+              <w:t>–</w:t>
+            </w:r>
+            <w:r>
+              <w:rPr>
+                <w:rFonts w:ascii="BRH Malayalam Extra" w:hAnsi="BRH Malayalam Extra" w:cs="BRH Malayalam Extra"/>
+                <w:color w:val="000000"/>
+                <w:sz w:val="40"/>
+                <w:szCs w:val="40"/>
+                <w:lang w:val="it-IT"/>
+              </w:rPr>
+              <w:t>Éx</w:t>
+            </w:r>
+            <w:r>
+              <w:rPr>
+                <w:rFonts w:ascii="BRH Malayalam Extra" w:hAnsi="BRH Malayalam Extra" w:cs="BRH Malayalam Extra"/>
+                <w:color w:val="000000"/>
+                <w:sz w:val="32"/>
+                <w:szCs w:val="40"/>
+                <w:lang w:val="it-IT"/>
+              </w:rPr>
+              <w:t>–</w:t>
+            </w:r>
+            <w:r>
+              <w:rPr>
+                <w:rFonts w:ascii="BRH Malayalam Extra" w:hAnsi="BRH Malayalam Extra" w:cs="BRH Malayalam Extra"/>
+                <w:color w:val="000000"/>
+                <w:sz w:val="40"/>
+                <w:szCs w:val="40"/>
+                <w:lang w:val="it-IT"/>
+              </w:rPr>
+              <w:t xml:space="preserve">J | </w:t>
             </w:r>
           </w:p>
         </w:tc>
@@ -3621,6 +4159,7 @@
                 <w:sz w:val="40"/>
                 <w:szCs w:val="40"/>
               </w:rPr>
+              <w:lastRenderedPageBreak/>
               <w:t>Ery—Yx</w:t>
             </w:r>
             <w:r>
@@ -3674,6 +4213,7 @@
                 <w:sz w:val="40"/>
                 <w:szCs w:val="40"/>
               </w:rPr>
+              <w:lastRenderedPageBreak/>
               <w:t>¥Z</w:t>
             </w:r>
             <w:r>
@@ -3728,6 +4268,7 @@
                 <w:sz w:val="40"/>
                 <w:szCs w:val="40"/>
               </w:rPr>
+              <w:lastRenderedPageBreak/>
               <w:t>Ery—Yx</w:t>
             </w:r>
             <w:r>
@@ -3790,6 +4331,7 @@
                 <w:sz w:val="28"/>
                 <w:szCs w:val="32"/>
               </w:rPr>
+              <w:lastRenderedPageBreak/>
               <w:t>T.S.4.4.12.4</w:t>
             </w:r>
             <w:r>
@@ -4301,7 +4843,6 @@
                 <w:sz w:val="32"/>
                 <w:szCs w:val="32"/>
               </w:rPr>
-              <w:lastRenderedPageBreak/>
               <w:t>Reference</w:t>
             </w:r>
           </w:p>
@@ -4324,7 +4865,6 @@
                 <w:sz w:val="32"/>
                 <w:szCs w:val="32"/>
               </w:rPr>
-              <w:lastRenderedPageBreak/>
               <w:t>As Printed</w:t>
             </w:r>
           </w:p>
@@ -5588,6 +6128,7 @@
                 <w:sz w:val="28"/>
                 <w:szCs w:val="32"/>
               </w:rPr>
+              <w:lastRenderedPageBreak/>
               <w:t>T.S.4.4.2.3 – Kramam</w:t>
             </w:r>
           </w:p>
@@ -6569,7 +7110,6 @@
                 <w:sz w:val="40"/>
                 <w:szCs w:val="40"/>
               </w:rPr>
-              <w:lastRenderedPageBreak/>
               <w:t>Aky—ræ¥diyÒ |</w:t>
             </w:r>
             <w:r>
@@ -6609,7 +7149,6 @@
                 <w:szCs w:val="40"/>
                 <w:highlight w:val="green"/>
               </w:rPr>
-              <w:lastRenderedPageBreak/>
               <w:t>Px</w:t>
             </w:r>
             <w:r>
@@ -6643,7 +7182,6 @@
                 <w:sz w:val="40"/>
                 <w:szCs w:val="40"/>
               </w:rPr>
-              <w:lastRenderedPageBreak/>
               <w:t>Aky—ræ¥diyÒ |</w:t>
             </w:r>
           </w:p>
@@ -6682,7 +7220,6 @@
                 <w:sz w:val="28"/>
                 <w:szCs w:val="32"/>
               </w:rPr>
-              <w:lastRenderedPageBreak/>
               <w:t>T.S.4.4.3.2 – Kramam</w:t>
             </w:r>
           </w:p>
@@ -7834,6 +8371,7 @@
                 <w:sz w:val="28"/>
                 <w:szCs w:val="32"/>
               </w:rPr>
+              <w:lastRenderedPageBreak/>
               <w:t>T.S.4.4.4.3 – Kramam</w:t>
             </w:r>
           </w:p>
@@ -8694,7 +9232,6 @@
                 <w:sz w:val="28"/>
                 <w:szCs w:val="32"/>
               </w:rPr>
-              <w:lastRenderedPageBreak/>
               <w:t>Panchaati No</w:t>
             </w:r>
             <w:r>
@@ -8741,7 +9278,6 @@
                 <w:sz w:val="40"/>
                 <w:szCs w:val="40"/>
               </w:rPr>
-              <w:lastRenderedPageBreak/>
               <w:t>¥sëx</w:t>
             </w:r>
             <w:r>
@@ -8814,17 +9350,7 @@
                 <w:sz w:val="40"/>
                 <w:szCs w:val="40"/>
               </w:rPr>
-              <w:t xml:space="preserve"> </w:t>
-            </w:r>
-            <w:r>
-              <w:rPr>
-                <w:rFonts w:ascii="BRH Malayalam Extra" w:hAnsi="BRH Malayalam Extra" w:cs="BRH Malayalam Extra"/>
-                <w:color w:val="000000"/>
-                <w:sz w:val="40"/>
-                <w:szCs w:val="40"/>
-              </w:rPr>
-              <w:lastRenderedPageBreak/>
-              <w:t xml:space="preserve">CZy— </w:t>
+              <w:t xml:space="preserve"> CZy— </w:t>
             </w:r>
             <w:r>
               <w:rPr>
@@ -8890,7 +9416,6 @@
                 <w:sz w:val="40"/>
                 <w:szCs w:val="40"/>
               </w:rPr>
-              <w:lastRenderedPageBreak/>
               <w:t>¥sëx</w:t>
             </w:r>
             <w:r>
@@ -8963,17 +9488,7 @@
                 <w:sz w:val="40"/>
                 <w:szCs w:val="40"/>
               </w:rPr>
-              <w:t xml:space="preserve"> </w:t>
-            </w:r>
-            <w:r>
-              <w:rPr>
-                <w:rFonts w:ascii="BRH Malayalam Extra" w:hAnsi="BRH Malayalam Extra" w:cs="BRH Malayalam Extra"/>
-                <w:color w:val="000000"/>
-                <w:sz w:val="40"/>
-                <w:szCs w:val="40"/>
-              </w:rPr>
-              <w:lastRenderedPageBreak/>
-              <w:t xml:space="preserve">CZy— </w:t>
+              <w:t xml:space="preserve"> CZy— </w:t>
             </w:r>
             <w:r>
               <w:rPr>
@@ -9057,7 +9572,6 @@
                 <w:sz w:val="28"/>
                 <w:szCs w:val="32"/>
               </w:rPr>
-              <w:lastRenderedPageBreak/>
               <w:t>T.S.4.4.4.7 – Kramam</w:t>
             </w:r>
           </w:p>
@@ -10306,6 +10820,7 @@
                 <w:sz w:val="28"/>
                 <w:szCs w:val="32"/>
               </w:rPr>
+              <w:lastRenderedPageBreak/>
               <w:t>T.S.4.4.9.1 – Kramam</w:t>
             </w:r>
           </w:p>
@@ -10944,7 +11459,6 @@
                 <w:sz w:val="28"/>
                 <w:szCs w:val="32"/>
               </w:rPr>
-              <w:lastRenderedPageBreak/>
               <w:t>T.S.4.4.10.1 – Kramam</w:t>
             </w:r>
           </w:p>
@@ -12331,6 +12845,7 @@
                 <w:sz w:val="40"/>
                 <w:szCs w:val="40"/>
               </w:rPr>
+              <w:lastRenderedPageBreak/>
               <w:t>sxi— ±öZ</w:t>
             </w:r>
             <w:r>
@@ -12378,6 +12893,7 @@
                 <w:sz w:val="40"/>
                 <w:szCs w:val="40"/>
               </w:rPr>
+              <w:lastRenderedPageBreak/>
               <w:t>g£</w:t>
             </w:r>
             <w:r>
@@ -12438,6 +12954,7 @@
                 <w:sz w:val="40"/>
                 <w:szCs w:val="40"/>
               </w:rPr>
+              <w:lastRenderedPageBreak/>
               <w:t>sxi— ±öZ</w:t>
             </w:r>
             <w:r>
@@ -12494,6 +13011,7 @@
                 <w:sz w:val="28"/>
                 <w:szCs w:val="32"/>
               </w:rPr>
+              <w:lastRenderedPageBreak/>
               <w:t>T.S.4.4.12.5 – Kramam</w:t>
             </w:r>
           </w:p>
@@ -12840,7 +13358,6 @@
           <w:szCs w:val="32"/>
           <w:u w:val="single"/>
         </w:rPr>
-        <w:lastRenderedPageBreak/>
         <w:t xml:space="preserve">TS </w:t>
       </w:r>
       <w:r>

</xml_diff>